<commit_message>
supprimer momentanéiment le test dans ci.yml
</commit_message>
<xml_diff>
--- a/video et fichiers à publier/Presentation_DevOps_TaskManager_Microservices_v2 - blue.docx
+++ b/video et fichiers à publier/Presentation_DevOps_TaskManager_Microservices_v2 - blue.docx
@@ -76,7 +76,19 @@
           <w:szCs w:val="24"/>
           <w:lang w:val="fr-FR"/>
         </w:rPr>
-        <w:t>Microservices</w:t>
+        <w:t>M</w:t>
+      </w:r>
+      <w:bookmarkStart w:id="0" w:name="_GoBack"/>
+      <w:bookmarkEnd w:id="0"/>
+      <w:r>
+        <w:rPr>
+          <w:rFonts w:ascii="Times New Roman" w:hAnsi="Times New Roman" w:cs="Times New Roman"/>
+          <w:color w:val="002060"/>
+          <w:sz w:val="24"/>
+          <w:szCs w:val="24"/>
+          <w:lang w:val="fr-FR"/>
+        </w:rPr>
+        <w:t>icroservices</w:t>
       </w:r>
       <w:proofErr w:type="spellEnd"/>
     </w:p>
@@ -328,17 +340,21 @@
           <w:color w:val="002060"/>
           <w:sz w:val="24"/>
           <w:szCs w:val="24"/>
-        </w:rPr>
-      </w:pPr>
+          <w:lang w:val="fr-FR"/>
+        </w:rPr>
+      </w:pPr>
+      <w:proofErr w:type="spellStart"/>
       <w:r>
         <w:rPr>
           <w:rFonts w:ascii="Times New Roman" w:hAnsi="Times New Roman" w:cs="Times New Roman"/>
           <w:color w:val="002060"/>
           <w:sz w:val="24"/>
           <w:szCs w:val="24"/>
+          <w:lang w:val="fr-FR"/>
         </w:rPr>
         <w:t>GitHub</w:t>
       </w:r>
+      <w:proofErr w:type="spellEnd"/>
     </w:p>
     <w:p>
       <w:pPr>
@@ -355,8 +371,6 @@
         </w:rPr>
         <w:t>Rôle  :</w:t>
       </w:r>
-      <w:bookmarkStart w:id="0" w:name="_GoBack"/>
-      <w:bookmarkEnd w:id="0"/>
       <w:proofErr w:type="gramEnd"/>
     </w:p>
     <w:p>
@@ -856,47 +870,18 @@
           <w:color w:val="002060"/>
           <w:sz w:val="24"/>
           <w:szCs w:val="24"/>
-        </w:rPr>
-      </w:pPr>
-      <w:proofErr w:type="spellStart"/>
+          <w:lang w:val="fr-FR"/>
+        </w:rPr>
+      </w:pPr>
       <w:r>
         <w:rPr>
           <w:rFonts w:ascii="Times New Roman" w:hAnsi="Times New Roman" w:cs="Times New Roman"/>
           <w:color w:val="002060"/>
           <w:sz w:val="24"/>
           <w:szCs w:val="24"/>
-        </w:rPr>
-        <w:t>modifie</w:t>
-      </w:r>
-      <w:proofErr w:type="spellEnd"/>
-      <w:r>
-        <w:rPr>
-          <w:rFonts w:ascii="Times New Roman" w:hAnsi="Times New Roman" w:cs="Times New Roman"/>
-          <w:color w:val="002060"/>
-          <w:sz w:val="24"/>
-          <w:szCs w:val="24"/>
-        </w:rPr>
-        <w:t xml:space="preserve"> un </w:t>
-      </w:r>
-      <w:proofErr w:type="spellStart"/>
-      <w:r>
-        <w:rPr>
-          <w:rFonts w:ascii="Times New Roman" w:hAnsi="Times New Roman" w:cs="Times New Roman"/>
-          <w:color w:val="002060"/>
-          <w:sz w:val="24"/>
-          <w:szCs w:val="24"/>
-        </w:rPr>
-        <w:t>fichier</w:t>
-      </w:r>
-      <w:proofErr w:type="spellEnd"/>
-      <w:r>
-        <w:rPr>
-          <w:rFonts w:ascii="Times New Roman" w:hAnsi="Times New Roman" w:cs="Times New Roman"/>
-          <w:color w:val="002060"/>
-          <w:sz w:val="24"/>
-          <w:szCs w:val="24"/>
-        </w:rPr>
-        <w:t xml:space="preserve"> de configuration, </w:t>
+          <w:lang w:val="fr-FR"/>
+        </w:rPr>
+        <w:t xml:space="preserve">modifie un fichier de configuration, </w:t>
       </w:r>
     </w:p>
     <w:p>
@@ -1083,16 +1068,30 @@
           <w:color w:val="002060"/>
           <w:sz w:val="24"/>
           <w:szCs w:val="24"/>
-        </w:rPr>
-      </w:pPr>
+          <w:lang w:val="fr-FR"/>
+        </w:rPr>
+      </w:pPr>
+      <w:proofErr w:type="spellStart"/>
       <w:r>
         <w:rPr>
           <w:rFonts w:ascii="Times New Roman" w:hAnsi="Times New Roman" w:cs="Times New Roman"/>
           <w:color w:val="002060"/>
           <w:sz w:val="24"/>
           <w:szCs w:val="24"/>
-        </w:rPr>
-        <w:t>GitHub Actions (CI/CD)</w:t>
+          <w:lang w:val="fr-FR"/>
+        </w:rPr>
+        <w:t>GitHub</w:t>
+      </w:r>
+      <w:proofErr w:type="spellEnd"/>
+      <w:r>
+        <w:rPr>
+          <w:rFonts w:ascii="Times New Roman" w:hAnsi="Times New Roman" w:cs="Times New Roman"/>
+          <w:color w:val="002060"/>
+          <w:sz w:val="24"/>
+          <w:szCs w:val="24"/>
+          <w:lang w:val="fr-FR"/>
+        </w:rPr>
+        <w:t xml:space="preserve"> Actions (CI/CD)</w:t>
       </w:r>
     </w:p>
     <w:p>
@@ -1311,19 +1310,19 @@
           <w:color w:val="002060"/>
           <w:sz w:val="24"/>
           <w:szCs w:val="24"/>
-        </w:rPr>
-      </w:pPr>
-      <w:proofErr w:type="spellStart"/>
+          <w:lang w:val="fr-FR"/>
+        </w:rPr>
+      </w:pPr>
       <w:r>
         <w:rPr>
           <w:rFonts w:ascii="Times New Roman" w:hAnsi="Times New Roman" w:cs="Times New Roman"/>
           <w:color w:val="002060"/>
           <w:sz w:val="24"/>
           <w:szCs w:val="24"/>
+          <w:lang w:val="fr-FR"/>
         </w:rPr>
         <w:t>Rôle</w:t>
       </w:r>
-      <w:proofErr w:type="spellEnd"/>
     </w:p>
     <w:p>
       <w:pPr>
@@ -1631,6 +1630,7 @@
           <w:color w:val="002060"/>
           <w:sz w:val="24"/>
           <w:szCs w:val="24"/>
+          <w:lang w:val="fr-FR"/>
         </w:rPr>
       </w:pPr>
       <w:r>
@@ -1639,31 +1639,10 @@
           <w:color w:val="002060"/>
           <w:sz w:val="24"/>
           <w:szCs w:val="24"/>
-        </w:rPr>
-        <w:t xml:space="preserve">Le document </w:t>
-      </w:r>
-      <w:proofErr w:type="spellStart"/>
-      <w:proofErr w:type="gramStart"/>
-      <w:r>
-        <w:rPr>
-          <w:rFonts w:ascii="Times New Roman" w:hAnsi="Times New Roman" w:cs="Times New Roman"/>
-          <w:color w:val="002060"/>
-          <w:sz w:val="24"/>
-          <w:szCs w:val="24"/>
-        </w:rPr>
-        <w:t>précise</w:t>
-      </w:r>
-      <w:proofErr w:type="spellEnd"/>
-      <w:r>
-        <w:rPr>
-          <w:rFonts w:ascii="Times New Roman" w:hAnsi="Times New Roman" w:cs="Times New Roman"/>
-          <w:color w:val="002060"/>
-          <w:sz w:val="24"/>
-          <w:szCs w:val="24"/>
-        </w:rPr>
-        <w:t xml:space="preserve"> :</w:t>
-      </w:r>
-      <w:proofErr w:type="gramEnd"/>
+          <w:lang w:val="fr-FR"/>
+        </w:rPr>
+        <w:t>Le document précise :</w:t>
+      </w:r>
     </w:p>
     <w:p>
       <w:pPr>
@@ -2457,6 +2436,7 @@
           <w:color w:val="002060"/>
           <w:sz w:val="24"/>
           <w:szCs w:val="24"/>
+          <w:lang w:val="fr-FR"/>
         </w:rPr>
       </w:pPr>
       <w:r>
@@ -2465,20 +2445,10 @@
           <w:color w:val="002060"/>
           <w:sz w:val="24"/>
           <w:szCs w:val="24"/>
-        </w:rPr>
-        <w:t xml:space="preserve">Son </w:t>
-      </w:r>
-      <w:proofErr w:type="spellStart"/>
-      <w:r>
-        <w:rPr>
-          <w:rFonts w:ascii="Times New Roman" w:hAnsi="Times New Roman" w:cs="Times New Roman"/>
-          <w:color w:val="002060"/>
-          <w:sz w:val="24"/>
-          <w:szCs w:val="24"/>
-        </w:rPr>
-        <w:t>rôle</w:t>
-      </w:r>
-      <w:proofErr w:type="spellEnd"/>
+          <w:lang w:val="fr-FR"/>
+        </w:rPr>
+        <w:t>Son rôle</w:t>
+      </w:r>
     </w:p>
     <w:p>
       <w:pPr>
@@ -2618,107 +2588,18 @@
           <w:color w:val="002060"/>
           <w:sz w:val="24"/>
           <w:szCs w:val="24"/>
-        </w:rPr>
-      </w:pPr>
-      <w:proofErr w:type="spellStart"/>
+          <w:lang w:val="fr-FR"/>
+        </w:rPr>
+      </w:pPr>
       <w:r>
         <w:rPr>
           <w:rFonts w:ascii="Times New Roman" w:hAnsi="Times New Roman" w:cs="Times New Roman"/>
           <w:color w:val="002060"/>
           <w:sz w:val="24"/>
           <w:szCs w:val="24"/>
-        </w:rPr>
-        <w:t>redémarrer</w:t>
-      </w:r>
-      <w:proofErr w:type="spellEnd"/>
-      <w:r>
-        <w:rPr>
-          <w:rFonts w:ascii="Times New Roman" w:hAnsi="Times New Roman" w:cs="Times New Roman"/>
-          <w:color w:val="002060"/>
-          <w:sz w:val="24"/>
-          <w:szCs w:val="24"/>
-        </w:rPr>
-        <w:t xml:space="preserve"> </w:t>
-      </w:r>
-      <w:proofErr w:type="spellStart"/>
-      <w:r>
-        <w:rPr>
-          <w:rFonts w:ascii="Times New Roman" w:hAnsi="Times New Roman" w:cs="Times New Roman"/>
-          <w:color w:val="002060"/>
-          <w:sz w:val="24"/>
-          <w:szCs w:val="24"/>
-        </w:rPr>
-        <w:t>automatiquement</w:t>
-      </w:r>
-      <w:proofErr w:type="spellEnd"/>
-      <w:r>
-        <w:rPr>
-          <w:rFonts w:ascii="Times New Roman" w:hAnsi="Times New Roman" w:cs="Times New Roman"/>
-          <w:color w:val="002060"/>
-          <w:sz w:val="24"/>
-          <w:szCs w:val="24"/>
-        </w:rPr>
-        <w:t xml:space="preserve"> un service </w:t>
-      </w:r>
-      <w:proofErr w:type="spellStart"/>
-      <w:r>
-        <w:rPr>
-          <w:rFonts w:ascii="Times New Roman" w:hAnsi="Times New Roman" w:cs="Times New Roman"/>
-          <w:color w:val="002060"/>
-          <w:sz w:val="24"/>
-          <w:szCs w:val="24"/>
-        </w:rPr>
-        <w:t>en</w:t>
-      </w:r>
-      <w:proofErr w:type="spellEnd"/>
-      <w:r>
-        <w:rPr>
-          <w:rFonts w:ascii="Times New Roman" w:hAnsi="Times New Roman" w:cs="Times New Roman"/>
-          <w:color w:val="002060"/>
-          <w:sz w:val="24"/>
-          <w:szCs w:val="24"/>
-        </w:rPr>
-        <w:t xml:space="preserve"> </w:t>
-      </w:r>
-      <w:proofErr w:type="spellStart"/>
-      <w:r>
-        <w:rPr>
-          <w:rFonts w:ascii="Times New Roman" w:hAnsi="Times New Roman" w:cs="Times New Roman"/>
-          <w:color w:val="002060"/>
-          <w:sz w:val="24"/>
-          <w:szCs w:val="24"/>
-        </w:rPr>
-        <w:t>cas</w:t>
-      </w:r>
-      <w:proofErr w:type="spellEnd"/>
-      <w:r>
-        <w:rPr>
-          <w:rFonts w:ascii="Times New Roman" w:hAnsi="Times New Roman" w:cs="Times New Roman"/>
-          <w:color w:val="002060"/>
-          <w:sz w:val="24"/>
-          <w:szCs w:val="24"/>
-        </w:rPr>
-        <w:t xml:space="preserve"> de </w:t>
-      </w:r>
-      <w:proofErr w:type="spellStart"/>
-      <w:r>
-        <w:rPr>
-          <w:rFonts w:ascii="Times New Roman" w:hAnsi="Times New Roman" w:cs="Times New Roman"/>
-          <w:color w:val="002060"/>
-          <w:sz w:val="24"/>
-          <w:szCs w:val="24"/>
-        </w:rPr>
-        <w:t>panne</w:t>
-      </w:r>
-      <w:proofErr w:type="spellEnd"/>
-      <w:r>
-        <w:rPr>
-          <w:rFonts w:ascii="Times New Roman" w:hAnsi="Times New Roman" w:cs="Times New Roman"/>
-          <w:color w:val="002060"/>
-          <w:sz w:val="24"/>
-          <w:szCs w:val="24"/>
-        </w:rPr>
-        <w:t xml:space="preserve">, </w:t>
+          <w:lang w:val="fr-FR"/>
+        </w:rPr>
+        <w:t xml:space="preserve">redémarrer automatiquement un service en cas de panne, </w:t>
       </w:r>
     </w:p>
     <w:p>
@@ -2768,29 +2649,18 @@
           <w:color w:val="002060"/>
           <w:sz w:val="24"/>
           <w:szCs w:val="24"/>
-        </w:rPr>
-      </w:pPr>
-      <w:proofErr w:type="spellStart"/>
-      <w:proofErr w:type="gramStart"/>
+          <w:lang w:val="fr-FR"/>
+        </w:rPr>
+      </w:pPr>
       <w:r>
         <w:rPr>
           <w:rFonts w:ascii="Times New Roman" w:hAnsi="Times New Roman" w:cs="Times New Roman"/>
           <w:color w:val="002060"/>
           <w:sz w:val="24"/>
           <w:szCs w:val="24"/>
-        </w:rPr>
-        <w:t>mettre</w:t>
-      </w:r>
-      <w:proofErr w:type="spellEnd"/>
-      <w:proofErr w:type="gramEnd"/>
-      <w:r>
-        <w:rPr>
-          <w:rFonts w:ascii="Times New Roman" w:hAnsi="Times New Roman" w:cs="Times New Roman"/>
-          <w:color w:val="002060"/>
-          <w:sz w:val="24"/>
-          <w:szCs w:val="24"/>
-        </w:rPr>
-        <w:t xml:space="preserve"> à jour les applications sans interruption.</w:t>
+          <w:lang w:val="fr-FR"/>
+        </w:rPr>
+        <w:t>mettre à jour les applications sans interruption.</w:t>
       </w:r>
     </w:p>
     <w:p>
@@ -2878,7 +2748,47 @@
           <w:szCs w:val="24"/>
           <w:lang w:val="fr-FR"/>
         </w:rPr>
-        <w:t xml:space="preserve">Figure 1 - Architecture </w:t>
+        <w:t xml:space="preserve">Figure 1 </w:t>
+      </w:r>
+      <w:r>
+        <w:rPr>
+          <w:rFonts w:ascii="Times New Roman" w:hAnsi="Times New Roman" w:cs="Times New Roman"/>
+          <w:color w:val="002060"/>
+          <w:sz w:val="24"/>
+          <w:szCs w:val="24"/>
+          <w:lang w:val="fr-FR"/>
+        </w:rPr>
+        <w:t>–</w:t>
+      </w:r>
+      <w:r>
+        <w:rPr>
+          <w:rFonts w:ascii="Times New Roman" w:hAnsi="Times New Roman" w:cs="Times New Roman"/>
+          <w:color w:val="002060"/>
+          <w:sz w:val="24"/>
+          <w:szCs w:val="24"/>
+          <w:lang w:val="fr-FR"/>
+        </w:rPr>
+        <w:t xml:space="preserve"> Architecture</w:t>
+      </w:r>
+      <w:r>
+        <w:rPr>
+          <w:rFonts w:ascii="Times New Roman" w:hAnsi="Times New Roman" w:cs="Times New Roman"/>
+          <w:color w:val="002060"/>
+          <w:sz w:val="24"/>
+          <w:szCs w:val="24"/>
+          <w:lang w:val="fr-FR"/>
+        </w:rPr>
+        <w:t> !/</w:t>
+      </w:r>
+      <w:r>
+        <w:rPr>
+          <w:rFonts w:ascii="Times New Roman" w:hAnsi="Times New Roman" w:cs="Times New Roman"/>
+          <w:color w:val="002060"/>
+          <w:sz w:val="24"/>
+          <w:szCs w:val="24"/>
+          <w:lang w:val="fr-FR"/>
+        </w:rPr>
+        <w:t xml:space="preserve"> </w:t>
       </w:r>
       <w:proofErr w:type="spellStart"/>
       <w:r>
@@ -3208,6 +3118,7 @@
           <w:color w:val="002060"/>
           <w:sz w:val="24"/>
           <w:szCs w:val="24"/>
+          <w:lang w:val="fr-FR"/>
         </w:rPr>
       </w:pPr>
       <w:r>
@@ -3216,9 +3127,54 @@
           <w:color w:val="002060"/>
           <w:sz w:val="24"/>
           <w:szCs w:val="24"/>
+          <w:lang w:val="fr-FR"/>
         </w:rPr>
         <w:lastRenderedPageBreak/>
-        <w:t>Workflow CI (Continuous Integration)</w:t>
+        <w:t>Workflow CI (</w:t>
+      </w:r>
+      <w:proofErr w:type="spellStart"/>
+      <w:r>
+        <w:rPr>
+          <w:rFonts w:ascii="Times New Roman" w:hAnsi="Times New Roman" w:cs="Times New Roman"/>
+          <w:color w:val="002060"/>
+          <w:sz w:val="24"/>
+          <w:szCs w:val="24"/>
+          <w:lang w:val="fr-FR"/>
+        </w:rPr>
+        <w:t>Continuous</w:t>
+      </w:r>
+      <w:proofErr w:type="spellEnd"/>
+      <w:r>
+        <w:rPr>
+          <w:rFonts w:ascii="Times New Roman" w:hAnsi="Times New Roman" w:cs="Times New Roman"/>
+          <w:color w:val="002060"/>
+          <w:sz w:val="24"/>
+          <w:szCs w:val="24"/>
+          <w:lang w:val="fr-FR"/>
+        </w:rPr>
+        <w:t xml:space="preserve"> </w:t>
+      </w:r>
+      <w:proofErr w:type="spellStart"/>
+      <w:r>
+        <w:rPr>
+          <w:rFonts w:ascii="Times New Roman" w:hAnsi="Times New Roman" w:cs="Times New Roman"/>
+          <w:color w:val="002060"/>
+          <w:sz w:val="24"/>
+          <w:szCs w:val="24"/>
+          <w:lang w:val="fr-FR"/>
+        </w:rPr>
+        <w:t>Integration</w:t>
+      </w:r>
+      <w:proofErr w:type="spellEnd"/>
+      <w:r>
+        <w:rPr>
+          <w:rFonts w:ascii="Times New Roman" w:hAnsi="Times New Roman" w:cs="Times New Roman"/>
+          <w:color w:val="002060"/>
+          <w:sz w:val="24"/>
+          <w:szCs w:val="24"/>
+          <w:lang w:val="fr-FR"/>
+        </w:rPr>
+        <w:t>)</w:t>
       </w:r>
     </w:p>
     <w:p>
@@ -3229,121 +3185,397 @@
           <w:color w:val="002060"/>
           <w:sz w:val="24"/>
           <w:szCs w:val="24"/>
-        </w:rPr>
-      </w:pPr>
+          <w:lang w:val="fr-FR"/>
+        </w:rPr>
+      </w:pPr>
+      <w:r>
+        <w:rPr>
+          <w:rFonts w:ascii="Times New Roman" w:hAnsi="Times New Roman" w:cs="Times New Roman"/>
+          <w:color w:val="002060"/>
+          <w:sz w:val="24"/>
+          <w:szCs w:val="24"/>
+          <w:lang w:val="fr-FR"/>
+        </w:rPr>
+        <w:t>Objectif</w:t>
+      </w:r>
+    </w:p>
+    <w:p>
+      <w:pPr>
+        <w:pStyle w:val="NormalWeb"/>
+        <w:rPr>
+          <w:color w:val="002060"/>
+        </w:rPr>
+      </w:pPr>
+      <w:r>
+        <w:rPr>
+          <w:color w:val="002060"/>
+        </w:rPr>
+        <w:t xml:space="preserve">Le workflow </w:t>
+      </w:r>
+      <w:r>
+        <w:rPr>
+          <w:rStyle w:val="lev"/>
+          <w:color w:val="002060"/>
+        </w:rPr>
+        <w:t>CI</w:t>
+      </w:r>
+      <w:r>
+        <w:rPr>
+          <w:color w:val="002060"/>
+        </w:rPr>
+        <w:t xml:space="preserve"> vérifie automatiquement que le code ajouté par les développeurs est correct avant son intégration dans la branche principale.</w:t>
+      </w:r>
+    </w:p>
+    <w:p>
+      <w:pPr>
+        <w:pStyle w:val="NormalWeb"/>
+        <w:rPr>
+          <w:color w:val="002060"/>
+        </w:rPr>
+      </w:pPr>
+      <w:r>
+        <w:rPr>
+          <w:color w:val="002060"/>
+        </w:rPr>
+        <w:t xml:space="preserve">À chaque </w:t>
+      </w:r>
+      <w:r>
+        <w:rPr>
+          <w:rStyle w:val="lev"/>
+          <w:color w:val="002060"/>
+        </w:rPr>
+        <w:t>commit</w:t>
+      </w:r>
+      <w:r>
+        <w:rPr>
+          <w:color w:val="002060"/>
+        </w:rPr>
+        <w:t xml:space="preserve"> ou </w:t>
+      </w:r>
+      <w:r>
+        <w:rPr>
+          <w:rStyle w:val="lev"/>
+          <w:color w:val="002060"/>
+        </w:rPr>
+        <w:t xml:space="preserve">Pull </w:t>
+      </w:r>
       <w:proofErr w:type="spellStart"/>
       <w:r>
         <w:rPr>
-          <w:rFonts w:ascii="Times New Roman" w:hAnsi="Times New Roman" w:cs="Times New Roman"/>
-          <w:color w:val="002060"/>
-          <w:sz w:val="24"/>
-          <w:szCs w:val="24"/>
-        </w:rPr>
-        <w:t>Objectif</w:t>
+          <w:rStyle w:val="lev"/>
+          <w:color w:val="002060"/>
+        </w:rPr>
+        <w:t>Request</w:t>
+      </w:r>
+      <w:proofErr w:type="spellEnd"/>
+      <w:r>
+        <w:rPr>
+          <w:color w:val="002060"/>
+        </w:rPr>
+        <w:t xml:space="preserve">, </w:t>
+      </w:r>
+      <w:proofErr w:type="spellStart"/>
+      <w:r>
+        <w:rPr>
+          <w:color w:val="002060"/>
+        </w:rPr>
+        <w:t>GitHub</w:t>
+      </w:r>
+      <w:proofErr w:type="spellEnd"/>
+      <w:r>
+        <w:rPr>
+          <w:color w:val="002060"/>
+        </w:rPr>
+        <w:t xml:space="preserve"> Actions peut exécuter les étapes suivantes :</w:t>
+      </w:r>
+    </w:p>
+    <w:p>
+      <w:pPr>
+        <w:pStyle w:val="PrformatHTML"/>
+        <w:rPr>
+          <w:rStyle w:val="CodeHTML"/>
+          <w:rFonts w:ascii="Times New Roman" w:eastAsiaTheme="majorEastAsia" w:hAnsi="Times New Roman" w:cs="Times New Roman"/>
+          <w:color w:val="002060"/>
+          <w:sz w:val="22"/>
+          <w:szCs w:val="22"/>
+        </w:rPr>
+      </w:pPr>
+      <w:r>
+        <w:rPr>
+          <w:rStyle w:val="CodeHTML"/>
+          <w:rFonts w:ascii="Times New Roman" w:eastAsiaTheme="majorEastAsia" w:hAnsi="Times New Roman" w:cs="Times New Roman"/>
+          <w:color w:val="002060"/>
+          <w:sz w:val="22"/>
+          <w:szCs w:val="22"/>
+        </w:rPr>
+        <w:t>Git Push</w:t>
+      </w:r>
+    </w:p>
+    <w:p>
+      <w:pPr>
+        <w:pStyle w:val="PrformatHTML"/>
+        <w:rPr>
+          <w:rStyle w:val="CodeHTML"/>
+          <w:rFonts w:ascii="Times New Roman" w:eastAsiaTheme="majorEastAsia" w:hAnsi="Times New Roman" w:cs="Times New Roman"/>
+          <w:color w:val="002060"/>
+          <w:sz w:val="22"/>
+          <w:szCs w:val="22"/>
+        </w:rPr>
+      </w:pPr>
+      <w:r>
+        <w:rPr>
+          <w:rStyle w:val="CodeHTML"/>
+          <w:rFonts w:ascii="Times New Roman" w:eastAsiaTheme="majorEastAsia" w:hAnsi="Times New Roman" w:cs="Times New Roman"/>
+          <w:color w:val="002060"/>
+          <w:sz w:val="22"/>
+          <w:szCs w:val="22"/>
+        </w:rPr>
+        <w:t xml:space="preserve">     │</w:t>
+      </w:r>
+    </w:p>
+    <w:p>
+      <w:pPr>
+        <w:pStyle w:val="PrformatHTML"/>
+        <w:rPr>
+          <w:rStyle w:val="CodeHTML"/>
+          <w:rFonts w:ascii="Times New Roman" w:eastAsiaTheme="majorEastAsia" w:hAnsi="Times New Roman" w:cs="Times New Roman"/>
+          <w:color w:val="002060"/>
+          <w:sz w:val="22"/>
+          <w:szCs w:val="22"/>
+        </w:rPr>
+      </w:pPr>
+      <w:r>
+        <w:rPr>
+          <w:rStyle w:val="CodeHTML"/>
+          <w:rFonts w:ascii="Times New Roman" w:eastAsiaTheme="majorEastAsia" w:hAnsi="Times New Roman" w:cs="Times New Roman"/>
+          <w:color w:val="002060"/>
+          <w:sz w:val="22"/>
+          <w:szCs w:val="22"/>
+        </w:rPr>
+        <w:t xml:space="preserve">     ▼</w:t>
+      </w:r>
+    </w:p>
+    <w:p>
+      <w:pPr>
+        <w:pStyle w:val="PrformatHTML"/>
+        <w:rPr>
+          <w:rStyle w:val="CodeHTML"/>
+          <w:rFonts w:ascii="Times New Roman" w:eastAsiaTheme="majorEastAsia" w:hAnsi="Times New Roman" w:cs="Times New Roman"/>
+          <w:color w:val="002060"/>
+          <w:sz w:val="22"/>
+          <w:szCs w:val="22"/>
+        </w:rPr>
+      </w:pPr>
+      <w:proofErr w:type="spellStart"/>
+      <w:r>
+        <w:rPr>
+          <w:rStyle w:val="CodeHTML"/>
+          <w:rFonts w:ascii="Times New Roman" w:eastAsiaTheme="majorEastAsia" w:hAnsi="Times New Roman" w:cs="Times New Roman"/>
+          <w:color w:val="002060"/>
+          <w:sz w:val="22"/>
+          <w:szCs w:val="22"/>
+        </w:rPr>
+        <w:t>GitHub</w:t>
+      </w:r>
+      <w:proofErr w:type="spellEnd"/>
+      <w:r>
+        <w:rPr>
+          <w:rStyle w:val="CodeHTML"/>
+          <w:rFonts w:ascii="Times New Roman" w:eastAsiaTheme="majorEastAsia" w:hAnsi="Times New Roman" w:cs="Times New Roman"/>
+          <w:color w:val="002060"/>
+          <w:sz w:val="22"/>
+          <w:szCs w:val="22"/>
+        </w:rPr>
+        <w:t xml:space="preserve"> Actions</w:t>
+      </w:r>
+    </w:p>
+    <w:p>
+      <w:pPr>
+        <w:pStyle w:val="PrformatHTML"/>
+        <w:rPr>
+          <w:rStyle w:val="CodeHTML"/>
+          <w:rFonts w:ascii="Times New Roman" w:eastAsiaTheme="majorEastAsia" w:hAnsi="Times New Roman" w:cs="Times New Roman"/>
+          <w:color w:val="002060"/>
+          <w:sz w:val="22"/>
+          <w:szCs w:val="22"/>
+        </w:rPr>
+      </w:pPr>
+      <w:r>
+        <w:rPr>
+          <w:rStyle w:val="CodeHTML"/>
+          <w:rFonts w:ascii="Times New Roman" w:eastAsiaTheme="majorEastAsia" w:hAnsi="Times New Roman" w:cs="Times New Roman"/>
+          <w:color w:val="002060"/>
+          <w:sz w:val="22"/>
+          <w:szCs w:val="22"/>
+        </w:rPr>
+        <w:t xml:space="preserve">     │</w:t>
+      </w:r>
+    </w:p>
+    <w:p>
+      <w:pPr>
+        <w:pStyle w:val="PrformatHTML"/>
+        <w:rPr>
+          <w:rStyle w:val="CodeHTML"/>
+          <w:rFonts w:ascii="Times New Roman" w:eastAsiaTheme="majorEastAsia" w:hAnsi="Times New Roman" w:cs="Times New Roman"/>
+          <w:color w:val="002060"/>
+          <w:sz w:val="22"/>
+          <w:szCs w:val="22"/>
+        </w:rPr>
+      </w:pPr>
+      <w:r>
+        <w:rPr>
+          <w:rStyle w:val="CodeHTML"/>
+          <w:rFonts w:ascii="Times New Roman" w:eastAsiaTheme="majorEastAsia" w:hAnsi="Times New Roman" w:cs="Times New Roman"/>
+          <w:color w:val="002060"/>
+          <w:sz w:val="22"/>
+          <w:szCs w:val="22"/>
+        </w:rPr>
+        <w:t xml:space="preserve">     ├── </w:t>
+      </w:r>
+      <w:proofErr w:type="spellStart"/>
+      <w:r>
+        <w:rPr>
+          <w:rStyle w:val="CodeHTML"/>
+          <w:rFonts w:ascii="Times New Roman" w:eastAsiaTheme="majorEastAsia" w:hAnsi="Times New Roman" w:cs="Times New Roman"/>
+          <w:color w:val="002060"/>
+          <w:sz w:val="22"/>
+          <w:szCs w:val="22"/>
+        </w:rPr>
+        <w:t>Checkout</w:t>
+      </w:r>
+      <w:proofErr w:type="spellEnd"/>
+      <w:r>
+        <w:rPr>
+          <w:rStyle w:val="CodeHTML"/>
+          <w:rFonts w:ascii="Times New Roman" w:eastAsiaTheme="majorEastAsia" w:hAnsi="Times New Roman" w:cs="Times New Roman"/>
+          <w:color w:val="002060"/>
+          <w:sz w:val="22"/>
+          <w:szCs w:val="22"/>
+        </w:rPr>
+        <w:t xml:space="preserve"> du code</w:t>
+      </w:r>
+    </w:p>
+    <w:p>
+      <w:pPr>
+        <w:pStyle w:val="PrformatHTML"/>
+        <w:rPr>
+          <w:rStyle w:val="CodeHTML"/>
+          <w:rFonts w:ascii="Times New Roman" w:eastAsiaTheme="majorEastAsia" w:hAnsi="Times New Roman" w:cs="Times New Roman"/>
+          <w:color w:val="002060"/>
+          <w:sz w:val="22"/>
+          <w:szCs w:val="22"/>
+        </w:rPr>
+      </w:pPr>
+      <w:r>
+        <w:rPr>
+          <w:rStyle w:val="CodeHTML"/>
+          <w:rFonts w:ascii="Times New Roman" w:eastAsiaTheme="majorEastAsia" w:hAnsi="Times New Roman" w:cs="Times New Roman"/>
+          <w:color w:val="002060"/>
+          <w:sz w:val="22"/>
+          <w:szCs w:val="22"/>
+        </w:rPr>
+        <w:t xml:space="preserve">     ├── Installation du JDK</w:t>
+      </w:r>
+    </w:p>
+    <w:p>
+      <w:pPr>
+        <w:pStyle w:val="PrformatHTML"/>
+        <w:rPr>
+          <w:rStyle w:val="CodeHTML"/>
+          <w:rFonts w:ascii="Times New Roman" w:eastAsiaTheme="majorEastAsia" w:hAnsi="Times New Roman" w:cs="Times New Roman"/>
+          <w:color w:val="002060"/>
+          <w:sz w:val="22"/>
+          <w:szCs w:val="22"/>
+        </w:rPr>
+      </w:pPr>
+      <w:r>
+        <w:rPr>
+          <w:rStyle w:val="CodeHTML"/>
+          <w:rFonts w:ascii="Times New Roman" w:eastAsiaTheme="majorEastAsia" w:hAnsi="Times New Roman" w:cs="Times New Roman"/>
+          <w:color w:val="002060"/>
+          <w:sz w:val="22"/>
+          <w:szCs w:val="22"/>
+        </w:rPr>
+        <w:t xml:space="preserve">     ├── Compilation </w:t>
+      </w:r>
+      <w:proofErr w:type="spellStart"/>
+      <w:r>
+        <w:rPr>
+          <w:rStyle w:val="CodeHTML"/>
+          <w:rFonts w:ascii="Times New Roman" w:eastAsiaTheme="majorEastAsia" w:hAnsi="Times New Roman" w:cs="Times New Roman"/>
+          <w:color w:val="002060"/>
+          <w:sz w:val="22"/>
+          <w:szCs w:val="22"/>
+        </w:rPr>
+        <w:t>Maven</w:t>
       </w:r>
       <w:proofErr w:type="spellEnd"/>
     </w:p>
     <w:p>
       <w:pPr>
-        <w:pStyle w:val="NormalWeb"/>
-        <w:rPr>
-          <w:color w:val="002060"/>
-        </w:rPr>
-      </w:pPr>
-      <w:r>
-        <w:rPr>
-          <w:color w:val="002060"/>
-        </w:rPr>
-        <w:t xml:space="preserve">Le workflow </w:t>
-      </w:r>
-      <w:r>
-        <w:rPr>
-          <w:rStyle w:val="lev"/>
-          <w:color w:val="002060"/>
-        </w:rPr>
-        <w:t>CI</w:t>
-      </w:r>
-      <w:r>
-        <w:rPr>
-          <w:color w:val="002060"/>
-        </w:rPr>
-        <w:t xml:space="preserve"> vérifie automatiquement que le code ajouté par les développeurs est correct avant son intégration dans la branche principale.</w:t>
+        <w:pStyle w:val="PrformatHTML"/>
+        <w:rPr>
+          <w:rStyle w:val="CodeHTML"/>
+          <w:rFonts w:ascii="Times New Roman" w:eastAsiaTheme="majorEastAsia" w:hAnsi="Times New Roman" w:cs="Times New Roman"/>
+          <w:color w:val="002060"/>
+          <w:sz w:val="22"/>
+          <w:szCs w:val="22"/>
+        </w:rPr>
+      </w:pPr>
+      <w:r>
+        <w:rPr>
+          <w:rStyle w:val="CodeHTML"/>
+          <w:rFonts w:ascii="Times New Roman" w:eastAsiaTheme="majorEastAsia" w:hAnsi="Times New Roman" w:cs="Times New Roman"/>
+          <w:color w:val="002060"/>
+          <w:sz w:val="22"/>
+          <w:szCs w:val="22"/>
+        </w:rPr>
+        <w:t xml:space="preserve">     ├── Exécution des tests</w:t>
       </w:r>
     </w:p>
     <w:p>
       <w:pPr>
-        <w:pStyle w:val="NormalWeb"/>
-        <w:rPr>
-          <w:color w:val="002060"/>
-        </w:rPr>
-      </w:pPr>
-      <w:r>
-        <w:rPr>
-          <w:color w:val="002060"/>
-        </w:rPr>
-        <w:t xml:space="preserve">À chaque </w:t>
-      </w:r>
-      <w:r>
-        <w:rPr>
-          <w:rStyle w:val="lev"/>
-          <w:color w:val="002060"/>
-        </w:rPr>
-        <w:t>commit</w:t>
-      </w:r>
-      <w:r>
-        <w:rPr>
-          <w:color w:val="002060"/>
-        </w:rPr>
-        <w:t xml:space="preserve"> ou </w:t>
-      </w:r>
-      <w:r>
-        <w:rPr>
-          <w:rStyle w:val="lev"/>
-          <w:color w:val="002060"/>
-        </w:rPr>
-        <w:t xml:space="preserve">Pull </w:t>
-      </w:r>
-      <w:proofErr w:type="spellStart"/>
-      <w:r>
-        <w:rPr>
-          <w:rStyle w:val="lev"/>
-          <w:color w:val="002060"/>
-        </w:rPr>
-        <w:t>Request</w:t>
-      </w:r>
-      <w:proofErr w:type="spellEnd"/>
-      <w:r>
-        <w:rPr>
-          <w:color w:val="002060"/>
-        </w:rPr>
-        <w:t xml:space="preserve">, </w:t>
-      </w:r>
-      <w:proofErr w:type="spellStart"/>
-      <w:r>
-        <w:rPr>
-          <w:color w:val="002060"/>
-        </w:rPr>
-        <w:t>GitHub</w:t>
-      </w:r>
-      <w:proofErr w:type="spellEnd"/>
-      <w:r>
-        <w:rPr>
-          <w:color w:val="002060"/>
-        </w:rPr>
-        <w:t xml:space="preserve"> Actions peut exécuter les étapes suivantes :</w:t>
+        <w:pStyle w:val="PrformatHTML"/>
+        <w:rPr>
+          <w:rStyle w:val="CodeHTML"/>
+          <w:rFonts w:ascii="Times New Roman" w:eastAsiaTheme="majorEastAsia" w:hAnsi="Times New Roman" w:cs="Times New Roman"/>
+          <w:color w:val="002060"/>
+          <w:sz w:val="22"/>
+          <w:szCs w:val="22"/>
+        </w:rPr>
+      </w:pPr>
+      <w:r>
+        <w:rPr>
+          <w:rStyle w:val="CodeHTML"/>
+          <w:rFonts w:ascii="Times New Roman" w:eastAsiaTheme="majorEastAsia" w:hAnsi="Times New Roman" w:cs="Times New Roman"/>
+          <w:color w:val="002060"/>
+          <w:sz w:val="22"/>
+          <w:szCs w:val="22"/>
+        </w:rPr>
+        <w:t xml:space="preserve">     ├── Analyse du résultat</w:t>
       </w:r>
     </w:p>
     <w:p>
       <w:pPr>
         <w:pStyle w:val="PrformatHTML"/>
         <w:rPr>
+          <w:rFonts w:ascii="Times New Roman" w:hAnsi="Times New Roman" w:cs="Times New Roman"/>
+          <w:color w:val="002060"/>
+          <w:sz w:val="22"/>
+          <w:szCs w:val="22"/>
+        </w:rPr>
+      </w:pPr>
+      <w:r>
+        <w:rPr>
           <w:rStyle w:val="CodeHTML"/>
           <w:rFonts w:ascii="Times New Roman" w:eastAsiaTheme="majorEastAsia" w:hAnsi="Times New Roman" w:cs="Times New Roman"/>
           <w:color w:val="002060"/>
           <w:sz w:val="22"/>
           <w:szCs w:val="22"/>
         </w:rPr>
-      </w:pPr>
+        <w:t xml:space="preserve">     └── Validation du </w:t>
+      </w:r>
+      <w:proofErr w:type="spellStart"/>
       <w:r>
         <w:rPr>
           <w:rStyle w:val="CodeHTML"/>
@@ -3352,211 +3584,106 @@
           <w:sz w:val="22"/>
           <w:szCs w:val="22"/>
         </w:rPr>
-        <w:t>Git Push</w:t>
-      </w:r>
-    </w:p>
-    <w:p>
-      <w:pPr>
-        <w:pStyle w:val="PrformatHTML"/>
-        <w:rPr>
-          <w:rStyle w:val="CodeHTML"/>
-          <w:rFonts w:ascii="Times New Roman" w:eastAsiaTheme="majorEastAsia" w:hAnsi="Times New Roman" w:cs="Times New Roman"/>
-          <w:color w:val="002060"/>
-          <w:sz w:val="22"/>
-          <w:szCs w:val="22"/>
-        </w:rPr>
-      </w:pPr>
-      <w:r>
-        <w:rPr>
-          <w:rStyle w:val="CodeHTML"/>
-          <w:rFonts w:ascii="Times New Roman" w:eastAsiaTheme="majorEastAsia" w:hAnsi="Times New Roman" w:cs="Times New Roman"/>
-          <w:color w:val="002060"/>
-          <w:sz w:val="22"/>
-          <w:szCs w:val="22"/>
-        </w:rPr>
-        <w:t xml:space="preserve">     │</w:t>
-      </w:r>
-    </w:p>
-    <w:p>
-      <w:pPr>
-        <w:pStyle w:val="PrformatHTML"/>
-        <w:rPr>
-          <w:rStyle w:val="CodeHTML"/>
-          <w:rFonts w:ascii="Times New Roman" w:eastAsiaTheme="majorEastAsia" w:hAnsi="Times New Roman" w:cs="Times New Roman"/>
-          <w:color w:val="002060"/>
-          <w:sz w:val="22"/>
-          <w:szCs w:val="22"/>
-        </w:rPr>
-      </w:pPr>
-      <w:r>
-        <w:rPr>
-          <w:rStyle w:val="CodeHTML"/>
-          <w:rFonts w:ascii="Times New Roman" w:eastAsiaTheme="majorEastAsia" w:hAnsi="Times New Roman" w:cs="Times New Roman"/>
-          <w:color w:val="002060"/>
-          <w:sz w:val="22"/>
-          <w:szCs w:val="22"/>
-        </w:rPr>
-        <w:t xml:space="preserve">     ▼</w:t>
-      </w:r>
-    </w:p>
-    <w:p>
-      <w:pPr>
-        <w:pStyle w:val="PrformatHTML"/>
-        <w:rPr>
-          <w:rStyle w:val="CodeHTML"/>
-          <w:rFonts w:ascii="Times New Roman" w:eastAsiaTheme="majorEastAsia" w:hAnsi="Times New Roman" w:cs="Times New Roman"/>
-          <w:color w:val="002060"/>
-          <w:sz w:val="22"/>
-          <w:szCs w:val="22"/>
-        </w:rPr>
-      </w:pPr>
-      <w:proofErr w:type="spellStart"/>
-      <w:r>
-        <w:rPr>
-          <w:rStyle w:val="CodeHTML"/>
-          <w:rFonts w:ascii="Times New Roman" w:eastAsiaTheme="majorEastAsia" w:hAnsi="Times New Roman" w:cs="Times New Roman"/>
-          <w:color w:val="002060"/>
-          <w:sz w:val="22"/>
-          <w:szCs w:val="22"/>
-        </w:rPr>
-        <w:t>GitHub</w:t>
-      </w:r>
-      <w:proofErr w:type="spellEnd"/>
-      <w:r>
-        <w:rPr>
-          <w:rStyle w:val="CodeHTML"/>
-          <w:rFonts w:ascii="Times New Roman" w:eastAsiaTheme="majorEastAsia" w:hAnsi="Times New Roman" w:cs="Times New Roman"/>
-          <w:color w:val="002060"/>
-          <w:sz w:val="22"/>
-          <w:szCs w:val="22"/>
-        </w:rPr>
-        <w:t xml:space="preserve"> Actions</w:t>
-      </w:r>
-    </w:p>
-    <w:p>
-      <w:pPr>
-        <w:pStyle w:val="PrformatHTML"/>
-        <w:rPr>
-          <w:rStyle w:val="CodeHTML"/>
-          <w:rFonts w:ascii="Times New Roman" w:eastAsiaTheme="majorEastAsia" w:hAnsi="Times New Roman" w:cs="Times New Roman"/>
-          <w:color w:val="002060"/>
-          <w:sz w:val="22"/>
-          <w:szCs w:val="22"/>
-        </w:rPr>
-      </w:pPr>
-      <w:r>
-        <w:rPr>
-          <w:rStyle w:val="CodeHTML"/>
-          <w:rFonts w:ascii="Times New Roman" w:eastAsiaTheme="majorEastAsia" w:hAnsi="Times New Roman" w:cs="Times New Roman"/>
-          <w:color w:val="002060"/>
-          <w:sz w:val="22"/>
-          <w:szCs w:val="22"/>
-        </w:rPr>
-        <w:t xml:space="preserve">     │</w:t>
-      </w:r>
-    </w:p>
-    <w:p>
-      <w:pPr>
-        <w:pStyle w:val="PrformatHTML"/>
-        <w:rPr>
-          <w:rStyle w:val="CodeHTML"/>
-          <w:rFonts w:ascii="Times New Roman" w:eastAsiaTheme="majorEastAsia" w:hAnsi="Times New Roman" w:cs="Times New Roman"/>
-          <w:color w:val="002060"/>
-          <w:sz w:val="22"/>
-          <w:szCs w:val="22"/>
-        </w:rPr>
-      </w:pPr>
-      <w:r>
-        <w:rPr>
-          <w:rStyle w:val="CodeHTML"/>
-          <w:rFonts w:ascii="Times New Roman" w:eastAsiaTheme="majorEastAsia" w:hAnsi="Times New Roman" w:cs="Times New Roman"/>
-          <w:color w:val="002060"/>
-          <w:sz w:val="22"/>
-          <w:szCs w:val="22"/>
-        </w:rPr>
-        <w:t xml:space="preserve">     ├── </w:t>
-      </w:r>
-      <w:proofErr w:type="spellStart"/>
-      <w:r>
-        <w:rPr>
-          <w:rStyle w:val="CodeHTML"/>
-          <w:rFonts w:ascii="Times New Roman" w:eastAsiaTheme="majorEastAsia" w:hAnsi="Times New Roman" w:cs="Times New Roman"/>
-          <w:color w:val="002060"/>
-          <w:sz w:val="22"/>
-          <w:szCs w:val="22"/>
-        </w:rPr>
-        <w:t>Checkout</w:t>
-      </w:r>
-      <w:proofErr w:type="spellEnd"/>
-      <w:r>
-        <w:rPr>
-          <w:rStyle w:val="CodeHTML"/>
-          <w:rFonts w:ascii="Times New Roman" w:eastAsiaTheme="majorEastAsia" w:hAnsi="Times New Roman" w:cs="Times New Roman"/>
-          <w:color w:val="002060"/>
-          <w:sz w:val="22"/>
-          <w:szCs w:val="22"/>
-        </w:rPr>
-        <w:t xml:space="preserve"> du code</w:t>
-      </w:r>
-    </w:p>
-    <w:p>
-      <w:pPr>
-        <w:pStyle w:val="PrformatHTML"/>
-        <w:rPr>
-          <w:rStyle w:val="CodeHTML"/>
-          <w:rFonts w:ascii="Times New Roman" w:eastAsiaTheme="majorEastAsia" w:hAnsi="Times New Roman" w:cs="Times New Roman"/>
-          <w:color w:val="002060"/>
-          <w:sz w:val="22"/>
-          <w:szCs w:val="22"/>
-        </w:rPr>
-      </w:pPr>
-      <w:r>
-        <w:rPr>
-          <w:rStyle w:val="CodeHTML"/>
-          <w:rFonts w:ascii="Times New Roman" w:eastAsiaTheme="majorEastAsia" w:hAnsi="Times New Roman" w:cs="Times New Roman"/>
-          <w:color w:val="002060"/>
-          <w:sz w:val="22"/>
-          <w:szCs w:val="22"/>
-        </w:rPr>
-        <w:t xml:space="preserve">     ├── Installation du JDK</w:t>
-      </w:r>
-    </w:p>
-    <w:p>
-      <w:pPr>
-        <w:pStyle w:val="PrformatHTML"/>
-        <w:rPr>
-          <w:rStyle w:val="CodeHTML"/>
-          <w:rFonts w:ascii="Times New Roman" w:eastAsiaTheme="majorEastAsia" w:hAnsi="Times New Roman" w:cs="Times New Roman"/>
-          <w:color w:val="002060"/>
-          <w:sz w:val="22"/>
-          <w:szCs w:val="22"/>
-        </w:rPr>
-      </w:pPr>
-      <w:r>
-        <w:rPr>
-          <w:rStyle w:val="CodeHTML"/>
-          <w:rFonts w:ascii="Times New Roman" w:eastAsiaTheme="majorEastAsia" w:hAnsi="Times New Roman" w:cs="Times New Roman"/>
-          <w:color w:val="002060"/>
-          <w:sz w:val="22"/>
-          <w:szCs w:val="22"/>
-        </w:rPr>
-        <w:t xml:space="preserve">     ├── Compilation </w:t>
-      </w:r>
-      <w:proofErr w:type="spellStart"/>
-      <w:r>
-        <w:rPr>
-          <w:rStyle w:val="CodeHTML"/>
-          <w:rFonts w:ascii="Times New Roman" w:eastAsiaTheme="majorEastAsia" w:hAnsi="Times New Roman" w:cs="Times New Roman"/>
-          <w:color w:val="002060"/>
-          <w:sz w:val="22"/>
-          <w:szCs w:val="22"/>
-        </w:rPr>
-        <w:t>Maven</w:t>
+        <w:t>build</w:t>
       </w:r>
       <w:proofErr w:type="spellEnd"/>
     </w:p>
     <w:p>
       <w:pPr>
+        <w:rPr>
+          <w:rFonts w:ascii="Times New Roman" w:hAnsi="Times New Roman" w:cs="Times New Roman"/>
+          <w:color w:val="002060"/>
+          <w:sz w:val="24"/>
+          <w:szCs w:val="24"/>
+          <w:lang w:val="fr-FR"/>
+        </w:rPr>
+      </w:pPr>
+    </w:p>
+    <w:p>
+      <w:pPr>
+        <w:pStyle w:val="Titre1"/>
+        <w:rPr>
+          <w:rFonts w:ascii="Times New Roman" w:hAnsi="Times New Roman" w:cs="Times New Roman"/>
+          <w:color w:val="002060"/>
+          <w:sz w:val="24"/>
+          <w:szCs w:val="24"/>
+        </w:rPr>
+      </w:pPr>
+      <w:r>
+        <w:rPr>
+          <w:rFonts w:ascii="Times New Roman" w:hAnsi="Times New Roman" w:cs="Times New Roman"/>
+          <w:color w:val="002060"/>
+          <w:sz w:val="24"/>
+          <w:szCs w:val="24"/>
+        </w:rPr>
+        <w:t>Workflow CD (Continuous Delivery / Deployment)</w:t>
+      </w:r>
+    </w:p>
+    <w:p>
+      <w:pPr>
+        <w:pStyle w:val="Titre2"/>
+        <w:rPr>
+          <w:rFonts w:ascii="Times New Roman" w:hAnsi="Times New Roman" w:cs="Times New Roman"/>
+          <w:color w:val="002060"/>
+          <w:sz w:val="24"/>
+          <w:szCs w:val="24"/>
+          <w:lang w:val="fr-FR"/>
+        </w:rPr>
+      </w:pPr>
+      <w:r>
+        <w:rPr>
+          <w:rFonts w:ascii="Times New Roman" w:hAnsi="Times New Roman" w:cs="Times New Roman"/>
+          <w:color w:val="002060"/>
+          <w:sz w:val="24"/>
+          <w:szCs w:val="24"/>
+          <w:lang w:val="fr-FR"/>
+        </w:rPr>
+        <w:t>Objectif</w:t>
+      </w:r>
+    </w:p>
+    <w:p>
+      <w:pPr>
+        <w:pStyle w:val="NormalWeb"/>
+        <w:rPr>
+          <w:color w:val="002060"/>
+        </w:rPr>
+      </w:pPr>
+      <w:r>
+        <w:rPr>
+          <w:color w:val="002060"/>
+        </w:rPr>
+        <w:t xml:space="preserve">Une fois la compilation et les tests validés par le workflow CI, le workflow </w:t>
+      </w:r>
+      <w:r>
+        <w:rPr>
+          <w:rStyle w:val="lev"/>
+          <w:color w:val="002060"/>
+        </w:rPr>
+        <w:t>CD</w:t>
+      </w:r>
+      <w:r>
+        <w:rPr>
+          <w:color w:val="002060"/>
+        </w:rPr>
+        <w:t xml:space="preserve"> automatise la création des images Docker et leur déploiement.</w:t>
+      </w:r>
+    </w:p>
+    <w:p>
+      <w:pPr>
+        <w:pStyle w:val="NormalWeb"/>
+        <w:rPr>
+          <w:color w:val="002060"/>
+        </w:rPr>
+      </w:pPr>
+      <w:r>
+        <w:rPr>
+          <w:color w:val="002060"/>
+        </w:rPr>
+        <w:t>Le document décrit cette chaîne CI/CD comme :</w:t>
+      </w:r>
+    </w:p>
+    <w:p>
+      <w:pPr>
         <w:pStyle w:val="PrformatHTML"/>
         <w:rPr>
           <w:rStyle w:val="CodeHTML"/>
@@ -3564,6 +3691,7 @@
           <w:color w:val="002060"/>
           <w:sz w:val="22"/>
           <w:szCs w:val="22"/>
+          <w:lang w:val="en-GB"/>
         </w:rPr>
       </w:pPr>
       <w:r>
@@ -3573,8 +3701,9 @@
           <w:color w:val="002060"/>
           <w:sz w:val="22"/>
           <w:szCs w:val="22"/>
-        </w:rPr>
-        <w:t xml:space="preserve">     ├── Exécution des tests</w:t>
+          <w:lang w:val="en-GB"/>
+        </w:rPr>
+        <w:t>Commit</w:t>
       </w:r>
     </w:p>
     <w:p>
@@ -3586,6 +3715,7 @@
           <w:color w:val="002060"/>
           <w:sz w:val="22"/>
           <w:szCs w:val="22"/>
+          <w:lang w:val="en-GB"/>
         </w:rPr>
       </w:pPr>
       <w:r>
@@ -3595,18 +3725,21 @@
           <w:color w:val="002060"/>
           <w:sz w:val="22"/>
           <w:szCs w:val="22"/>
-        </w:rPr>
-        <w:t xml:space="preserve">     ├── Analyse du résultat</w:t>
+          <w:lang w:val="en-GB"/>
+        </w:rPr>
+        <w:t xml:space="preserve"> ↓</w:t>
       </w:r>
     </w:p>
     <w:p>
       <w:pPr>
         <w:pStyle w:val="PrformatHTML"/>
         <w:rPr>
-          <w:rFonts w:ascii="Times New Roman" w:hAnsi="Times New Roman" w:cs="Times New Roman"/>
+          <w:rStyle w:val="CodeHTML"/>
+          <w:rFonts w:ascii="Times New Roman" w:eastAsiaTheme="majorEastAsia" w:hAnsi="Times New Roman" w:cs="Times New Roman"/>
           <w:color w:val="002060"/>
           <w:sz w:val="22"/>
           <w:szCs w:val="22"/>
+          <w:lang w:val="en-GB"/>
         </w:rPr>
       </w:pPr>
       <w:r>
@@ -3616,428 +3749,269 @@
           <w:color w:val="002060"/>
           <w:sz w:val="22"/>
           <w:szCs w:val="22"/>
-        </w:rPr>
-        <w:t xml:space="preserve">     └── Validation du </w:t>
-      </w:r>
-      <w:proofErr w:type="spellStart"/>
-      <w:r>
+          <w:lang w:val="en-GB"/>
+        </w:rPr>
+        <w:t>Build</w:t>
+      </w:r>
+    </w:p>
+    <w:p>
+      <w:pPr>
+        <w:pStyle w:val="PrformatHTML"/>
         <w:rPr>
           <w:rStyle w:val="CodeHTML"/>
           <w:rFonts w:ascii="Times New Roman" w:eastAsiaTheme="majorEastAsia" w:hAnsi="Times New Roman" w:cs="Times New Roman"/>
           <w:color w:val="002060"/>
           <w:sz w:val="22"/>
           <w:szCs w:val="22"/>
-        </w:rPr>
-        <w:t>build</w:t>
+          <w:lang w:val="en-GB"/>
+        </w:rPr>
+      </w:pPr>
+      <w:r>
+        <w:rPr>
+          <w:rStyle w:val="CodeHTML"/>
+          <w:rFonts w:ascii="Times New Roman" w:eastAsiaTheme="majorEastAsia" w:hAnsi="Times New Roman" w:cs="Times New Roman"/>
+          <w:color w:val="002060"/>
+          <w:sz w:val="22"/>
+          <w:szCs w:val="22"/>
+          <w:lang w:val="en-GB"/>
+        </w:rPr>
+        <w:t xml:space="preserve"> ↓</w:t>
+      </w:r>
+    </w:p>
+    <w:p>
+      <w:pPr>
+        <w:pStyle w:val="PrformatHTML"/>
+        <w:rPr>
+          <w:rStyle w:val="CodeHTML"/>
+          <w:rFonts w:ascii="Times New Roman" w:eastAsiaTheme="majorEastAsia" w:hAnsi="Times New Roman" w:cs="Times New Roman"/>
+          <w:color w:val="002060"/>
+          <w:sz w:val="22"/>
+          <w:szCs w:val="22"/>
+          <w:lang w:val="en-GB"/>
+        </w:rPr>
+      </w:pPr>
+      <w:r>
+        <w:rPr>
+          <w:rStyle w:val="CodeHTML"/>
+          <w:rFonts w:ascii="Times New Roman" w:eastAsiaTheme="majorEastAsia" w:hAnsi="Times New Roman" w:cs="Times New Roman"/>
+          <w:color w:val="002060"/>
+          <w:sz w:val="22"/>
+          <w:szCs w:val="22"/>
+          <w:lang w:val="en-GB"/>
+        </w:rPr>
+        <w:t>Test</w:t>
+      </w:r>
+    </w:p>
+    <w:p>
+      <w:pPr>
+        <w:pStyle w:val="PrformatHTML"/>
+        <w:rPr>
+          <w:rStyle w:val="CodeHTML"/>
+          <w:rFonts w:ascii="Times New Roman" w:eastAsiaTheme="majorEastAsia" w:hAnsi="Times New Roman" w:cs="Times New Roman"/>
+          <w:color w:val="002060"/>
+          <w:sz w:val="22"/>
+          <w:szCs w:val="22"/>
+          <w:lang w:val="en-GB"/>
+        </w:rPr>
+      </w:pPr>
+      <w:r>
+        <w:rPr>
+          <w:rStyle w:val="CodeHTML"/>
+          <w:rFonts w:ascii="Times New Roman" w:eastAsiaTheme="majorEastAsia" w:hAnsi="Times New Roman" w:cs="Times New Roman"/>
+          <w:color w:val="002060"/>
+          <w:sz w:val="22"/>
+          <w:szCs w:val="22"/>
+          <w:lang w:val="en-GB"/>
+        </w:rPr>
+        <w:t xml:space="preserve"> ↓</w:t>
+      </w:r>
+    </w:p>
+    <w:p>
+      <w:pPr>
+        <w:pStyle w:val="PrformatHTML"/>
+        <w:rPr>
+          <w:rStyle w:val="CodeHTML"/>
+          <w:rFonts w:ascii="Times New Roman" w:eastAsiaTheme="majorEastAsia" w:hAnsi="Times New Roman" w:cs="Times New Roman"/>
+          <w:color w:val="002060"/>
+          <w:sz w:val="22"/>
+          <w:szCs w:val="22"/>
+          <w:lang w:val="en-GB"/>
+        </w:rPr>
+      </w:pPr>
+      <w:r>
+        <w:rPr>
+          <w:rStyle w:val="CodeHTML"/>
+          <w:rFonts w:ascii="Times New Roman" w:eastAsiaTheme="majorEastAsia" w:hAnsi="Times New Roman" w:cs="Times New Roman"/>
+          <w:color w:val="002060"/>
+          <w:sz w:val="22"/>
+          <w:szCs w:val="22"/>
+          <w:lang w:val="en-GB"/>
+        </w:rPr>
+        <w:t>Docker</w:t>
+      </w:r>
+    </w:p>
+    <w:p>
+      <w:pPr>
+        <w:pStyle w:val="PrformatHTML"/>
+        <w:rPr>
+          <w:rStyle w:val="CodeHTML"/>
+          <w:rFonts w:ascii="Times New Roman" w:eastAsiaTheme="majorEastAsia" w:hAnsi="Times New Roman" w:cs="Times New Roman"/>
+          <w:color w:val="002060"/>
+          <w:sz w:val="22"/>
+          <w:szCs w:val="22"/>
+          <w:lang w:val="en-GB"/>
+        </w:rPr>
+      </w:pPr>
+      <w:r>
+        <w:rPr>
+          <w:rStyle w:val="CodeHTML"/>
+          <w:rFonts w:ascii="Times New Roman" w:eastAsiaTheme="majorEastAsia" w:hAnsi="Times New Roman" w:cs="Times New Roman"/>
+          <w:color w:val="002060"/>
+          <w:sz w:val="22"/>
+          <w:szCs w:val="22"/>
+          <w:lang w:val="en-GB"/>
+        </w:rPr>
+        <w:t xml:space="preserve"> ↓</w:t>
+      </w:r>
+    </w:p>
+    <w:p>
+      <w:pPr>
+        <w:pStyle w:val="PrformatHTML"/>
+        <w:rPr>
+          <w:rStyle w:val="CodeHTML"/>
+          <w:rFonts w:ascii="Times New Roman" w:eastAsiaTheme="majorEastAsia" w:hAnsi="Times New Roman" w:cs="Times New Roman"/>
+          <w:color w:val="002060"/>
+          <w:sz w:val="22"/>
+          <w:szCs w:val="22"/>
+          <w:lang w:val="en-GB"/>
+        </w:rPr>
+      </w:pPr>
+      <w:r>
+        <w:rPr>
+          <w:rStyle w:val="CodeHTML"/>
+          <w:rFonts w:ascii="Times New Roman" w:eastAsiaTheme="majorEastAsia" w:hAnsi="Times New Roman" w:cs="Times New Roman"/>
+          <w:color w:val="002060"/>
+          <w:sz w:val="22"/>
+          <w:szCs w:val="22"/>
+          <w:lang w:val="en-GB"/>
+        </w:rPr>
+        <w:t>Push</w:t>
+      </w:r>
+    </w:p>
+    <w:p>
+      <w:pPr>
+        <w:pStyle w:val="PrformatHTML"/>
+        <w:rPr>
+          <w:rStyle w:val="CodeHTML"/>
+          <w:rFonts w:ascii="Times New Roman" w:eastAsiaTheme="majorEastAsia" w:hAnsi="Times New Roman" w:cs="Times New Roman"/>
+          <w:color w:val="002060"/>
+          <w:sz w:val="22"/>
+          <w:szCs w:val="22"/>
+          <w:lang w:val="en-GB"/>
+        </w:rPr>
+      </w:pPr>
+      <w:r>
+        <w:rPr>
+          <w:rStyle w:val="CodeHTML"/>
+          <w:rFonts w:ascii="Times New Roman" w:eastAsiaTheme="majorEastAsia" w:hAnsi="Times New Roman" w:cs="Times New Roman"/>
+          <w:color w:val="002060"/>
+          <w:sz w:val="22"/>
+          <w:szCs w:val="22"/>
+          <w:lang w:val="en-GB"/>
+        </w:rPr>
+        <w:t xml:space="preserve"> ↓</w:t>
+      </w:r>
+    </w:p>
+    <w:p>
+      <w:pPr>
+        <w:pStyle w:val="PrformatHTML"/>
+        <w:rPr>
+          <w:rStyle w:val="CodeHTML"/>
+          <w:rFonts w:ascii="Times New Roman" w:eastAsiaTheme="majorEastAsia" w:hAnsi="Times New Roman" w:cs="Times New Roman"/>
+          <w:color w:val="002060"/>
+          <w:sz w:val="22"/>
+          <w:szCs w:val="22"/>
+        </w:rPr>
+      </w:pPr>
+      <w:proofErr w:type="spellStart"/>
+      <w:r>
+        <w:rPr>
+          <w:rStyle w:val="CodeHTML"/>
+          <w:rFonts w:ascii="Times New Roman" w:eastAsiaTheme="majorEastAsia" w:hAnsi="Times New Roman" w:cs="Times New Roman"/>
+          <w:color w:val="002060"/>
+          <w:sz w:val="22"/>
+          <w:szCs w:val="22"/>
+        </w:rPr>
+        <w:t>Deploy</w:t>
       </w:r>
       <w:proofErr w:type="spellEnd"/>
     </w:p>
     <w:p>
       <w:pPr>
-        <w:rPr>
-          <w:rFonts w:ascii="Times New Roman" w:hAnsi="Times New Roman" w:cs="Times New Roman"/>
-          <w:color w:val="002060"/>
-          <w:sz w:val="24"/>
-          <w:szCs w:val="24"/>
-          <w:lang w:val="fr-FR"/>
-        </w:rPr>
-      </w:pPr>
+        <w:pStyle w:val="PrformatHTML"/>
+        <w:rPr>
+          <w:rStyle w:val="CodeHTML"/>
+          <w:rFonts w:ascii="Times New Roman" w:eastAsiaTheme="majorEastAsia" w:hAnsi="Times New Roman" w:cs="Times New Roman"/>
+          <w:color w:val="002060"/>
+          <w:sz w:val="22"/>
+          <w:szCs w:val="22"/>
+        </w:rPr>
+      </w:pPr>
+      <w:r>
+        <w:rPr>
+          <w:rStyle w:val="CodeHTML"/>
+          <w:rFonts w:ascii="Times New Roman" w:eastAsiaTheme="majorEastAsia" w:hAnsi="Times New Roman" w:cs="Times New Roman"/>
+          <w:color w:val="002060"/>
+          <w:sz w:val="22"/>
+          <w:szCs w:val="22"/>
+        </w:rPr>
+        <w:t xml:space="preserve"> ↓</w:t>
+      </w:r>
     </w:p>
     <w:p>
       <w:pPr>
-        <w:pStyle w:val="Titre1"/>
+        <w:pStyle w:val="PrformatHTML"/>
         <w:rPr>
           <w:rFonts w:ascii="Times New Roman" w:hAnsi="Times New Roman" w:cs="Times New Roman"/>
           <w:color w:val="002060"/>
-          <w:sz w:val="24"/>
-          <w:szCs w:val="24"/>
-        </w:rPr>
-      </w:pPr>
-      <w:r>
-        <w:rPr>
-          <w:rFonts w:ascii="Times New Roman" w:hAnsi="Times New Roman" w:cs="Times New Roman"/>
-          <w:color w:val="002060"/>
-          <w:sz w:val="24"/>
-          <w:szCs w:val="24"/>
-        </w:rPr>
-        <w:t>Workflow CD (Continuous Delivery / Deployment)</w:t>
-      </w:r>
-    </w:p>
-    <w:p>
-      <w:pPr>
-        <w:pStyle w:val="Titre2"/>
-        <w:rPr>
-          <w:rFonts w:ascii="Times New Roman" w:hAnsi="Times New Roman" w:cs="Times New Roman"/>
-          <w:color w:val="002060"/>
-          <w:sz w:val="24"/>
-          <w:szCs w:val="24"/>
+          <w:sz w:val="22"/>
+          <w:szCs w:val="22"/>
         </w:rPr>
       </w:pPr>
       <w:proofErr w:type="spellStart"/>
       <w:r>
         <w:rPr>
-          <w:rFonts w:ascii="Times New Roman" w:hAnsi="Times New Roman" w:cs="Times New Roman"/>
-          <w:color w:val="002060"/>
-          <w:sz w:val="24"/>
-          <w:szCs w:val="24"/>
-        </w:rPr>
-        <w:t>Objectif</w:t>
+          <w:rStyle w:val="CodeHTML"/>
+          <w:rFonts w:ascii="Times New Roman" w:eastAsiaTheme="majorEastAsia" w:hAnsi="Times New Roman" w:cs="Times New Roman"/>
+          <w:color w:val="002060"/>
+          <w:sz w:val="22"/>
+          <w:szCs w:val="22"/>
+        </w:rPr>
+        <w:t>Verify</w:t>
       </w:r>
       <w:proofErr w:type="spellEnd"/>
     </w:p>
     <w:p>
       <w:pPr>
-        <w:pStyle w:val="NormalWeb"/>
-        <w:rPr>
-          <w:color w:val="002060"/>
-        </w:rPr>
-      </w:pPr>
-      <w:r>
-        <w:rPr>
-          <w:color w:val="002060"/>
-        </w:rPr>
-        <w:t xml:space="preserve">Une fois la compilation et les tests validés par le workflow CI, le workflow </w:t>
-      </w:r>
-      <w:r>
-        <w:rPr>
-          <w:rStyle w:val="lev"/>
-          <w:color w:val="002060"/>
-        </w:rPr>
-        <w:t>CD</w:t>
-      </w:r>
-      <w:r>
-        <w:rPr>
-          <w:color w:val="002060"/>
-        </w:rPr>
-        <w:t xml:space="preserve"> automatise la création des images Docker et leur déploiement.</w:t>
-      </w:r>
-    </w:p>
-    <w:p>
-      <w:pPr>
-        <w:pStyle w:val="NormalWeb"/>
-        <w:rPr>
-          <w:color w:val="002060"/>
-        </w:rPr>
-      </w:pPr>
-      <w:r>
-        <w:rPr>
-          <w:color w:val="002060"/>
-        </w:rPr>
-        <w:t>Le document décrit cette chaîne CI/CD comme :</w:t>
-      </w:r>
-    </w:p>
-    <w:p>
-      <w:pPr>
-        <w:pStyle w:val="PrformatHTML"/>
-        <w:rPr>
-          <w:rStyle w:val="CodeHTML"/>
-          <w:rFonts w:ascii="Times New Roman" w:eastAsiaTheme="majorEastAsia" w:hAnsi="Times New Roman" w:cs="Times New Roman"/>
-          <w:color w:val="002060"/>
-          <w:sz w:val="22"/>
-          <w:szCs w:val="22"/>
-        </w:rPr>
-      </w:pPr>
-      <w:r>
-        <w:rPr>
-          <w:rStyle w:val="CodeHTML"/>
-          <w:rFonts w:ascii="Times New Roman" w:eastAsiaTheme="majorEastAsia" w:hAnsi="Times New Roman" w:cs="Times New Roman"/>
-          <w:color w:val="002060"/>
-          <w:sz w:val="22"/>
-          <w:szCs w:val="22"/>
-        </w:rPr>
-        <w:t>Commit</w:t>
-      </w:r>
-    </w:p>
-    <w:p>
-      <w:pPr>
-        <w:pStyle w:val="PrformatHTML"/>
-        <w:rPr>
-          <w:rStyle w:val="CodeHTML"/>
-          <w:rFonts w:ascii="Times New Roman" w:eastAsiaTheme="majorEastAsia" w:hAnsi="Times New Roman" w:cs="Times New Roman"/>
-          <w:color w:val="002060"/>
-          <w:sz w:val="22"/>
-          <w:szCs w:val="22"/>
-        </w:rPr>
-      </w:pPr>
-      <w:r>
-        <w:rPr>
-          <w:rStyle w:val="CodeHTML"/>
-          <w:rFonts w:ascii="Times New Roman" w:eastAsiaTheme="majorEastAsia" w:hAnsi="Times New Roman" w:cs="Times New Roman"/>
-          <w:color w:val="002060"/>
-          <w:sz w:val="22"/>
-          <w:szCs w:val="22"/>
-        </w:rPr>
-        <w:t xml:space="preserve"> ↓</w:t>
-      </w:r>
-    </w:p>
-    <w:p>
-      <w:pPr>
-        <w:pStyle w:val="PrformatHTML"/>
-        <w:rPr>
-          <w:rStyle w:val="CodeHTML"/>
-          <w:rFonts w:ascii="Times New Roman" w:eastAsiaTheme="majorEastAsia" w:hAnsi="Times New Roman" w:cs="Times New Roman"/>
-          <w:color w:val="002060"/>
-          <w:sz w:val="22"/>
-          <w:szCs w:val="22"/>
-        </w:rPr>
-      </w:pPr>
-      <w:proofErr w:type="spellStart"/>
-      <w:r>
-        <w:rPr>
-          <w:rStyle w:val="CodeHTML"/>
-          <w:rFonts w:ascii="Times New Roman" w:eastAsiaTheme="majorEastAsia" w:hAnsi="Times New Roman" w:cs="Times New Roman"/>
-          <w:color w:val="002060"/>
-          <w:sz w:val="22"/>
-          <w:szCs w:val="22"/>
-        </w:rPr>
-        <w:t>Build</w:t>
-      </w:r>
-      <w:proofErr w:type="spellEnd"/>
-    </w:p>
-    <w:p>
-      <w:pPr>
-        <w:pStyle w:val="PrformatHTML"/>
-        <w:rPr>
-          <w:rStyle w:val="CodeHTML"/>
-          <w:rFonts w:ascii="Times New Roman" w:eastAsiaTheme="majorEastAsia" w:hAnsi="Times New Roman" w:cs="Times New Roman"/>
-          <w:color w:val="002060"/>
-          <w:sz w:val="22"/>
-          <w:szCs w:val="22"/>
-        </w:rPr>
-      </w:pPr>
-      <w:r>
-        <w:rPr>
-          <w:rStyle w:val="CodeHTML"/>
-          <w:rFonts w:ascii="Times New Roman" w:eastAsiaTheme="majorEastAsia" w:hAnsi="Times New Roman" w:cs="Times New Roman"/>
-          <w:color w:val="002060"/>
-          <w:sz w:val="22"/>
-          <w:szCs w:val="22"/>
-        </w:rPr>
-        <w:t xml:space="preserve"> ↓</w:t>
-      </w:r>
-    </w:p>
-    <w:p>
-      <w:pPr>
-        <w:pStyle w:val="PrformatHTML"/>
-        <w:rPr>
-          <w:rStyle w:val="CodeHTML"/>
-          <w:rFonts w:ascii="Times New Roman" w:eastAsiaTheme="majorEastAsia" w:hAnsi="Times New Roman" w:cs="Times New Roman"/>
-          <w:color w:val="002060"/>
-          <w:sz w:val="22"/>
-          <w:szCs w:val="22"/>
-        </w:rPr>
-      </w:pPr>
-      <w:r>
-        <w:rPr>
-          <w:rStyle w:val="CodeHTML"/>
-          <w:rFonts w:ascii="Times New Roman" w:eastAsiaTheme="majorEastAsia" w:hAnsi="Times New Roman" w:cs="Times New Roman"/>
-          <w:color w:val="002060"/>
-          <w:sz w:val="22"/>
-          <w:szCs w:val="22"/>
-        </w:rPr>
-        <w:t>Test</w:t>
-      </w:r>
-    </w:p>
-    <w:p>
-      <w:pPr>
-        <w:pStyle w:val="PrformatHTML"/>
-        <w:rPr>
-          <w:rStyle w:val="CodeHTML"/>
-          <w:rFonts w:ascii="Times New Roman" w:eastAsiaTheme="majorEastAsia" w:hAnsi="Times New Roman" w:cs="Times New Roman"/>
-          <w:color w:val="002060"/>
-          <w:sz w:val="22"/>
-          <w:szCs w:val="22"/>
-        </w:rPr>
-      </w:pPr>
-      <w:r>
-        <w:rPr>
-          <w:rStyle w:val="CodeHTML"/>
-          <w:rFonts w:ascii="Times New Roman" w:eastAsiaTheme="majorEastAsia" w:hAnsi="Times New Roman" w:cs="Times New Roman"/>
-          <w:color w:val="002060"/>
-          <w:sz w:val="22"/>
-          <w:szCs w:val="22"/>
-        </w:rPr>
-        <w:t xml:space="preserve"> ↓</w:t>
-      </w:r>
-    </w:p>
-    <w:p>
-      <w:pPr>
-        <w:pStyle w:val="PrformatHTML"/>
-        <w:rPr>
-          <w:rStyle w:val="CodeHTML"/>
-          <w:rFonts w:ascii="Times New Roman" w:eastAsiaTheme="majorEastAsia" w:hAnsi="Times New Roman" w:cs="Times New Roman"/>
-          <w:color w:val="002060"/>
-          <w:sz w:val="22"/>
-          <w:szCs w:val="22"/>
-        </w:rPr>
-      </w:pPr>
-      <w:r>
-        <w:rPr>
-          <w:rStyle w:val="CodeHTML"/>
-          <w:rFonts w:ascii="Times New Roman" w:eastAsiaTheme="majorEastAsia" w:hAnsi="Times New Roman" w:cs="Times New Roman"/>
-          <w:color w:val="002060"/>
-          <w:sz w:val="22"/>
-          <w:szCs w:val="22"/>
-        </w:rPr>
-        <w:t>Docker</w:t>
-      </w:r>
-    </w:p>
-    <w:p>
-      <w:pPr>
-        <w:pStyle w:val="PrformatHTML"/>
-        <w:rPr>
-          <w:rStyle w:val="CodeHTML"/>
-          <w:rFonts w:ascii="Times New Roman" w:eastAsiaTheme="majorEastAsia" w:hAnsi="Times New Roman" w:cs="Times New Roman"/>
-          <w:color w:val="002060"/>
-          <w:sz w:val="22"/>
-          <w:szCs w:val="22"/>
-        </w:rPr>
-      </w:pPr>
-      <w:r>
-        <w:rPr>
-          <w:rStyle w:val="CodeHTML"/>
-          <w:rFonts w:ascii="Times New Roman" w:eastAsiaTheme="majorEastAsia" w:hAnsi="Times New Roman" w:cs="Times New Roman"/>
-          <w:color w:val="002060"/>
-          <w:sz w:val="22"/>
-          <w:szCs w:val="22"/>
-        </w:rPr>
-        <w:t xml:space="preserve"> ↓</w:t>
-      </w:r>
-    </w:p>
-    <w:p>
-      <w:pPr>
-        <w:pStyle w:val="PrformatHTML"/>
-        <w:rPr>
-          <w:rStyle w:val="CodeHTML"/>
-          <w:rFonts w:ascii="Times New Roman" w:eastAsiaTheme="majorEastAsia" w:hAnsi="Times New Roman" w:cs="Times New Roman"/>
-          <w:color w:val="002060"/>
-          <w:sz w:val="22"/>
-          <w:szCs w:val="22"/>
-        </w:rPr>
-      </w:pPr>
-      <w:r>
-        <w:rPr>
-          <w:rStyle w:val="CodeHTML"/>
-          <w:rFonts w:ascii="Times New Roman" w:eastAsiaTheme="majorEastAsia" w:hAnsi="Times New Roman" w:cs="Times New Roman"/>
-          <w:color w:val="002060"/>
-          <w:sz w:val="22"/>
-          <w:szCs w:val="22"/>
-        </w:rPr>
-        <w:t>Push</w:t>
-      </w:r>
-    </w:p>
-    <w:p>
-      <w:pPr>
-        <w:pStyle w:val="PrformatHTML"/>
-        <w:rPr>
-          <w:rStyle w:val="CodeHTML"/>
-          <w:rFonts w:ascii="Times New Roman" w:eastAsiaTheme="majorEastAsia" w:hAnsi="Times New Roman" w:cs="Times New Roman"/>
-          <w:color w:val="002060"/>
-          <w:sz w:val="22"/>
-          <w:szCs w:val="22"/>
-        </w:rPr>
-      </w:pPr>
-      <w:r>
-        <w:rPr>
-          <w:rStyle w:val="CodeHTML"/>
-          <w:rFonts w:ascii="Times New Roman" w:eastAsiaTheme="majorEastAsia" w:hAnsi="Times New Roman" w:cs="Times New Roman"/>
-          <w:color w:val="002060"/>
-          <w:sz w:val="22"/>
-          <w:szCs w:val="22"/>
-        </w:rPr>
-        <w:t xml:space="preserve"> ↓</w:t>
-      </w:r>
-    </w:p>
-    <w:p>
-      <w:pPr>
-        <w:pStyle w:val="PrformatHTML"/>
-        <w:rPr>
-          <w:rStyle w:val="CodeHTML"/>
-          <w:rFonts w:ascii="Times New Roman" w:eastAsiaTheme="majorEastAsia" w:hAnsi="Times New Roman" w:cs="Times New Roman"/>
-          <w:color w:val="002060"/>
-          <w:sz w:val="22"/>
-          <w:szCs w:val="22"/>
-        </w:rPr>
-      </w:pPr>
-      <w:proofErr w:type="spellStart"/>
-      <w:r>
-        <w:rPr>
-          <w:rStyle w:val="CodeHTML"/>
-          <w:rFonts w:ascii="Times New Roman" w:eastAsiaTheme="majorEastAsia" w:hAnsi="Times New Roman" w:cs="Times New Roman"/>
-          <w:color w:val="002060"/>
-          <w:sz w:val="22"/>
-          <w:szCs w:val="22"/>
-        </w:rPr>
-        <w:t>Deploy</w:t>
-      </w:r>
-      <w:proofErr w:type="spellEnd"/>
-    </w:p>
-    <w:p>
-      <w:pPr>
-        <w:pStyle w:val="PrformatHTML"/>
-        <w:rPr>
-          <w:rStyle w:val="CodeHTML"/>
-          <w:rFonts w:ascii="Times New Roman" w:eastAsiaTheme="majorEastAsia" w:hAnsi="Times New Roman" w:cs="Times New Roman"/>
-          <w:color w:val="002060"/>
-          <w:sz w:val="22"/>
-          <w:szCs w:val="22"/>
-        </w:rPr>
-      </w:pPr>
-      <w:r>
-        <w:rPr>
-          <w:rStyle w:val="CodeHTML"/>
-          <w:rFonts w:ascii="Times New Roman" w:eastAsiaTheme="majorEastAsia" w:hAnsi="Times New Roman" w:cs="Times New Roman"/>
-          <w:color w:val="002060"/>
-          <w:sz w:val="22"/>
-          <w:szCs w:val="22"/>
-        </w:rPr>
-        <w:t xml:space="preserve"> ↓</w:t>
-      </w:r>
-    </w:p>
-    <w:p>
-      <w:pPr>
-        <w:pStyle w:val="PrformatHTML"/>
+        <w:pStyle w:val="Titre3"/>
         <w:rPr>
           <w:rFonts w:ascii="Times New Roman" w:hAnsi="Times New Roman" w:cs="Times New Roman"/>
           <w:color w:val="002060"/>
-          <w:sz w:val="22"/>
-          <w:szCs w:val="22"/>
-        </w:rPr>
-      </w:pPr>
-      <w:proofErr w:type="spellStart"/>
-      <w:r>
-        <w:rPr>
-          <w:rStyle w:val="CodeHTML"/>
-          <w:rFonts w:ascii="Times New Roman" w:eastAsiaTheme="majorEastAsia" w:hAnsi="Times New Roman" w:cs="Times New Roman"/>
-          <w:color w:val="002060"/>
-          <w:sz w:val="22"/>
-          <w:szCs w:val="22"/>
-        </w:rPr>
-        <w:t>Verify</w:t>
-      </w:r>
-      <w:proofErr w:type="spellEnd"/>
-    </w:p>
-    <w:p>
-      <w:pPr>
-        <w:pStyle w:val="Titre3"/>
+          <w:sz w:val="24"/>
+          <w:szCs w:val="24"/>
+          <w:lang w:val="fr-FR"/>
+        </w:rPr>
+      </w:pPr>
+      <w:r>
         <w:rPr>
           <w:rFonts w:ascii="Times New Roman" w:hAnsi="Times New Roman" w:cs="Times New Roman"/>
           <w:color w:val="002060"/>
           <w:sz w:val="24"/>
           <w:szCs w:val="24"/>
-        </w:rPr>
-      </w:pPr>
-      <w:proofErr w:type="spellStart"/>
-      <w:r>
-        <w:rPr>
-          <w:rFonts w:ascii="Times New Roman" w:hAnsi="Times New Roman" w:cs="Times New Roman"/>
-          <w:color w:val="002060"/>
-          <w:sz w:val="24"/>
-          <w:szCs w:val="24"/>
+          <w:lang w:val="fr-FR"/>
         </w:rPr>
         <w:t>Déroulement</w:t>
       </w:r>
-      <w:proofErr w:type="spellEnd"/>
     </w:p>
     <w:p>
       <w:pPr>
@@ -4786,11 +4760,13 @@
         <w:pStyle w:val="Titre2"/>
         <w:rPr>
           <w:color w:val="002060"/>
-        </w:rPr>
-      </w:pPr>
-      <w:r>
-        <w:rPr>
-          <w:color w:val="002060"/>
+          <w:lang w:val="fr-FR"/>
+        </w:rPr>
+      </w:pPr>
+      <w:r>
+        <w:rPr>
+          <w:color w:val="002060"/>
+          <w:lang w:val="fr-FR"/>
         </w:rPr>
         <w:t xml:space="preserve">• </w:t>
       </w:r>
@@ -4798,6 +4774,7 @@
       <w:r>
         <w:rPr>
           <w:color w:val="002060"/>
+          <w:lang w:val="fr-FR"/>
         </w:rPr>
         <w:t>Dockerfile</w:t>
       </w:r>
@@ -4837,11 +4814,13 @@
         <w:pStyle w:val="Titre2"/>
         <w:rPr>
           <w:color w:val="002060"/>
-        </w:rPr>
-      </w:pPr>
-      <w:r>
-        <w:rPr>
-          <w:color w:val="002060"/>
+          <w:lang w:val="fr-FR"/>
+        </w:rPr>
+      </w:pPr>
+      <w:r>
+        <w:rPr>
+          <w:color w:val="002060"/>
+          <w:lang w:val="fr-FR"/>
         </w:rPr>
         <w:t>• k8s/*.</w:t>
       </w:r>
@@ -4849,6 +4828,7 @@
       <w:r>
         <w:rPr>
           <w:color w:val="002060"/>
+          <w:lang w:val="fr-FR"/>
         </w:rPr>
         <w:t>yml</w:t>
       </w:r>
@@ -5190,11 +5170,13 @@
         <w:pStyle w:val="Titre2"/>
         <w:rPr>
           <w:color w:val="002060"/>
-        </w:rPr>
-      </w:pPr>
-      <w:r>
-        <w:rPr>
-          <w:color w:val="002060"/>
+          <w:lang w:val="fr-FR"/>
+        </w:rPr>
+      </w:pPr>
+      <w:r>
+        <w:rPr>
+          <w:color w:val="002060"/>
+          <w:lang w:val="fr-FR"/>
         </w:rPr>
         <w:t>• devops_files.py</w:t>
       </w:r>
@@ -5273,11 +5255,13 @@
         <w:pStyle w:val="Titre2"/>
         <w:rPr>
           <w:color w:val="002060"/>
-        </w:rPr>
-      </w:pPr>
-      <w:r>
-        <w:rPr>
-          <w:color w:val="002060"/>
+          <w:lang w:val="fr-FR"/>
+        </w:rPr>
+      </w:pPr>
+      <w:r>
+        <w:rPr>
+          <w:color w:val="002060"/>
+          <w:lang w:val="fr-FR"/>
         </w:rPr>
         <w:t>• devops_ci.py</w:t>
       </w:r>
@@ -5328,11 +5312,13 @@
         <w:pStyle w:val="Titre2"/>
         <w:rPr>
           <w:color w:val="002060"/>
-        </w:rPr>
-      </w:pPr>
-      <w:r>
-        <w:rPr>
-          <w:color w:val="002060"/>
+          <w:lang w:val="fr-FR"/>
+        </w:rPr>
+      </w:pPr>
+      <w:r>
+        <w:rPr>
+          <w:color w:val="002060"/>
+          <w:lang w:val="fr-FR"/>
         </w:rPr>
         <w:t>• .</w:t>
       </w:r>
@@ -5340,6 +5326,7 @@
       <w:r>
         <w:rPr>
           <w:color w:val="002060"/>
+          <w:lang w:val="fr-FR"/>
         </w:rPr>
         <w:t>env</w:t>
       </w:r>
@@ -5386,32 +5373,21 @@
         <w:pStyle w:val="Titre2"/>
         <w:rPr>
           <w:color w:val="002060"/>
-        </w:rPr>
-      </w:pPr>
-      <w:r>
-        <w:rPr>
-          <w:color w:val="002060"/>
-        </w:rPr>
-        <w:t xml:space="preserve">• </w:t>
-      </w:r>
-      <w:proofErr w:type="gramStart"/>
-      <w:r>
-        <w:rPr>
-          <w:color w:val="002060"/>
-        </w:rPr>
-        <w:t>application-</w:t>
-      </w:r>
-      <w:proofErr w:type="gramEnd"/>
-      <w:r>
-        <w:rPr>
-          <w:color w:val="002060"/>
-        </w:rPr>
-        <w:t>*.</w:t>
+          <w:lang w:val="fr-FR"/>
+        </w:rPr>
+      </w:pPr>
+      <w:r>
+        <w:rPr>
+          <w:color w:val="002060"/>
+          <w:lang w:val="fr-FR"/>
+        </w:rPr>
+        <w:t>• application-*.</w:t>
       </w:r>
       <w:proofErr w:type="spellStart"/>
       <w:r>
         <w:rPr>
           <w:color w:val="002060"/>
+          <w:lang w:val="fr-FR"/>
         </w:rPr>
         <w:t>yml</w:t>
       </w:r>
@@ -5518,42 +5494,23 @@
         <w:spacing w:before="100" w:beforeAutospacing="1" w:after="100" w:afterAutospacing="1" w:line="240" w:lineRule="auto"/>
         <w:rPr>
           <w:color w:val="002060"/>
-        </w:rPr>
-      </w:pPr>
-      <w:proofErr w:type="gramStart"/>
+          <w:lang w:val="fr-FR"/>
+        </w:rPr>
+      </w:pPr>
       <w:r>
         <w:rPr>
           <w:rStyle w:val="lev"/>
           <w:color w:val="002060"/>
+          <w:lang w:val="fr-FR"/>
         </w:rPr>
         <w:t>Docker</w:t>
       </w:r>
       <w:r>
         <w:rPr>
           <w:color w:val="002060"/>
-        </w:rPr>
-        <w:t xml:space="preserve"> assure</w:t>
-      </w:r>
-      <w:proofErr w:type="gramEnd"/>
-      <w:r>
-        <w:rPr>
-          <w:color w:val="002060"/>
-        </w:rPr>
-        <w:t xml:space="preserve"> la </w:t>
-      </w:r>
-      <w:proofErr w:type="spellStart"/>
-      <w:r>
-        <w:rPr>
-          <w:color w:val="002060"/>
-        </w:rPr>
-        <w:t>conteneurisation</w:t>
-      </w:r>
-      <w:proofErr w:type="spellEnd"/>
-      <w:r>
-        <w:rPr>
-          <w:color w:val="002060"/>
-        </w:rPr>
-        <w:t xml:space="preserve"> des applications. </w:t>
+          <w:lang w:val="fr-FR"/>
+        </w:rPr>
+        <w:t xml:space="preserve"> assure la conteneurisation des applications. </w:t>
       </w:r>
     </w:p>
     <w:p>
@@ -5565,62 +5522,25 @@
         <w:spacing w:before="100" w:beforeAutospacing="1" w:after="100" w:afterAutospacing="1" w:line="240" w:lineRule="auto"/>
         <w:rPr>
           <w:color w:val="002060"/>
-        </w:rPr>
-      </w:pPr>
+          <w:lang w:val="fr-FR"/>
+        </w:rPr>
+      </w:pPr>
+      <w:proofErr w:type="spellStart"/>
       <w:r>
         <w:rPr>
           <w:rStyle w:val="lev"/>
           <w:color w:val="002060"/>
+          <w:lang w:val="fr-FR"/>
         </w:rPr>
         <w:t>Kubernetes</w:t>
       </w:r>
-      <w:r>
-        <w:rPr>
-          <w:color w:val="002060"/>
-        </w:rPr>
-        <w:t xml:space="preserve"> </w:t>
-      </w:r>
-      <w:proofErr w:type="spellStart"/>
-      <w:r>
-        <w:rPr>
-          <w:color w:val="002060"/>
-        </w:rPr>
-        <w:t>orchestre</w:t>
-      </w:r>
       <w:proofErr w:type="spellEnd"/>
       <w:r>
         <w:rPr>
           <w:color w:val="002060"/>
-        </w:rPr>
-        <w:t xml:space="preserve"> les </w:t>
-      </w:r>
-      <w:proofErr w:type="spellStart"/>
-      <w:r>
-        <w:rPr>
-          <w:color w:val="002060"/>
-        </w:rPr>
-        <w:t>conteneurs</w:t>
-      </w:r>
-      <w:proofErr w:type="spellEnd"/>
-      <w:r>
-        <w:rPr>
-          <w:color w:val="002060"/>
-        </w:rPr>
-        <w:t xml:space="preserve"> </w:t>
-      </w:r>
-      <w:proofErr w:type="spellStart"/>
-      <w:r>
-        <w:rPr>
-          <w:color w:val="002060"/>
-        </w:rPr>
-        <w:t>en</w:t>
-      </w:r>
-      <w:proofErr w:type="spellEnd"/>
-      <w:r>
-        <w:rPr>
-          <w:color w:val="002060"/>
-        </w:rPr>
-        <w:t xml:space="preserve"> production. </w:t>
+          <w:lang w:val="fr-FR"/>
+        </w:rPr>
+        <w:t xml:space="preserve"> orchestre les conteneurs en production. </w:t>
       </w:r>
     </w:p>
     <w:p>
@@ -5632,62 +5552,49 @@
         <w:spacing w:before="100" w:beforeAutospacing="1" w:after="100" w:afterAutospacing="1" w:line="240" w:lineRule="auto"/>
         <w:rPr>
           <w:color w:val="002060"/>
-        </w:rPr>
-      </w:pPr>
+          <w:lang w:val="fr-FR"/>
+        </w:rPr>
+      </w:pPr>
+      <w:proofErr w:type="spellStart"/>
       <w:r>
         <w:rPr>
           <w:rStyle w:val="lev"/>
           <w:color w:val="002060"/>
-        </w:rPr>
-        <w:t>GitHub Actions</w:t>
-      </w:r>
-      <w:r>
-        <w:rPr>
-          <w:color w:val="002060"/>
-        </w:rPr>
-        <w:t xml:space="preserve"> </w:t>
+          <w:lang w:val="fr-FR"/>
+        </w:rPr>
+        <w:t>GitHub</w:t>
+      </w:r>
+      <w:proofErr w:type="spellEnd"/>
+      <w:r>
+        <w:rPr>
+          <w:rStyle w:val="lev"/>
+          <w:color w:val="002060"/>
+          <w:lang w:val="fr-FR"/>
+        </w:rPr>
+        <w:t xml:space="preserve"> Actions</w:t>
+      </w:r>
+      <w:r>
+        <w:rPr>
+          <w:color w:val="002060"/>
+          <w:lang w:val="fr-FR"/>
+        </w:rPr>
+        <w:t xml:space="preserve"> automatise les phases de </w:t>
       </w:r>
       <w:proofErr w:type="spellStart"/>
       <w:r>
         <w:rPr>
           <w:color w:val="002060"/>
-        </w:rPr>
-        <w:t>automatise</w:t>
+          <w:lang w:val="fr-FR"/>
+        </w:rPr>
+        <w:t>build</w:t>
       </w:r>
       <w:proofErr w:type="spellEnd"/>
       <w:r>
         <w:rPr>
           <w:color w:val="002060"/>
-        </w:rPr>
-        <w:t xml:space="preserve"> les phases de build, de test </w:t>
-      </w:r>
-      <w:proofErr w:type="gramStart"/>
-      <w:r>
-        <w:rPr>
-          <w:color w:val="002060"/>
-        </w:rPr>
-        <w:t>et</w:t>
-      </w:r>
-      <w:proofErr w:type="gramEnd"/>
-      <w:r>
-        <w:rPr>
-          <w:color w:val="002060"/>
-        </w:rPr>
-        <w:t xml:space="preserve"> de </w:t>
-      </w:r>
-      <w:proofErr w:type="spellStart"/>
-      <w:r>
-        <w:rPr>
-          <w:color w:val="002060"/>
-        </w:rPr>
-        <w:t>déploiement</w:t>
-      </w:r>
-      <w:proofErr w:type="spellEnd"/>
-      <w:r>
-        <w:rPr>
-          <w:color w:val="002060"/>
-        </w:rPr>
-        <w:t xml:space="preserve">. </w:t>
+          <w:lang w:val="fr-FR"/>
+        </w:rPr>
+        <w:t xml:space="preserve">, de test et de déploiement. </w:t>
       </w:r>
     </w:p>
     <w:p>
@@ -5699,11 +5606,13 @@
         <w:spacing w:before="100" w:beforeAutospacing="1" w:after="100" w:afterAutospacing="1" w:line="240" w:lineRule="auto"/>
         <w:rPr>
           <w:color w:val="002060"/>
-        </w:rPr>
-      </w:pPr>
-      <w:r>
-        <w:rPr>
-          <w:color w:val="002060"/>
+          <w:lang w:val="fr-FR"/>
+        </w:rPr>
+      </w:pPr>
+      <w:r>
+        <w:rPr>
+          <w:color w:val="002060"/>
+          <w:lang w:val="fr-FR"/>
         </w:rPr>
         <w:t xml:space="preserve">Les </w:t>
       </w:r>
@@ -5711,56 +5620,16 @@
         <w:rPr>
           <w:rStyle w:val="lev"/>
           <w:color w:val="002060"/>
+          <w:lang w:val="fr-FR"/>
         </w:rPr>
         <w:t>scripts Python</w:t>
       </w:r>
       <w:r>
         <w:rPr>
           <w:color w:val="002060"/>
-        </w:rPr>
-        <w:t xml:space="preserve"> </w:t>
-      </w:r>
-      <w:proofErr w:type="spellStart"/>
-      <w:r>
-        <w:rPr>
-          <w:color w:val="002060"/>
-        </w:rPr>
-        <w:t>facilitent</w:t>
-      </w:r>
-      <w:proofErr w:type="spellEnd"/>
-      <w:r>
-        <w:rPr>
-          <w:color w:val="002060"/>
-        </w:rPr>
-        <w:t xml:space="preserve"> les </w:t>
-      </w:r>
-      <w:proofErr w:type="spellStart"/>
-      <w:r>
-        <w:rPr>
-          <w:color w:val="002060"/>
-        </w:rPr>
-        <w:t>tâches</w:t>
-      </w:r>
-      <w:proofErr w:type="spellEnd"/>
-      <w:r>
-        <w:rPr>
-          <w:color w:val="002060"/>
-        </w:rPr>
-        <w:t xml:space="preserve"> </w:t>
-      </w:r>
-      <w:proofErr w:type="spellStart"/>
-      <w:r>
-        <w:rPr>
-          <w:color w:val="002060"/>
-        </w:rPr>
-        <w:t>répétitives</w:t>
-      </w:r>
-      <w:proofErr w:type="spellEnd"/>
-      <w:r>
-        <w:rPr>
-          <w:color w:val="002060"/>
-        </w:rPr>
-        <w:t xml:space="preserve">. </w:t>
+          <w:lang w:val="fr-FR"/>
+        </w:rPr>
+        <w:t xml:space="preserve"> facilitent les tâches répétitives. </w:t>
       </w:r>
     </w:p>
     <w:p>
@@ -5772,127 +5641,65 @@
         <w:spacing w:before="100" w:beforeAutospacing="1" w:after="100" w:afterAutospacing="1" w:line="240" w:lineRule="auto"/>
         <w:rPr>
           <w:color w:val="002060"/>
-        </w:rPr>
-      </w:pPr>
-      <w:r>
-        <w:rPr>
-          <w:color w:val="002060"/>
-        </w:rPr>
-        <w:t xml:space="preserve">Les </w:t>
+          <w:lang w:val="fr-FR"/>
+        </w:rPr>
+      </w:pPr>
+      <w:r>
+        <w:rPr>
+          <w:color w:val="002060"/>
+          <w:lang w:val="fr-FR"/>
+        </w:rPr>
+        <w:t xml:space="preserve">Les fichiers </w:t>
+      </w:r>
+      <w:r>
+        <w:rPr>
+          <w:rStyle w:val="lev"/>
+          <w:color w:val="002060"/>
+          <w:lang w:val="fr-FR"/>
+        </w:rPr>
+        <w:t>.</w:t>
       </w:r>
       <w:proofErr w:type="spellStart"/>
       <w:r>
         <w:rPr>
-          <w:color w:val="002060"/>
-        </w:rPr>
-        <w:t>fichiers</w:t>
+          <w:rStyle w:val="lev"/>
+          <w:color w:val="002060"/>
+          <w:lang w:val="fr-FR"/>
+        </w:rPr>
+        <w:t>env</w:t>
       </w:r>
       <w:proofErr w:type="spellEnd"/>
       <w:r>
         <w:rPr>
           <w:color w:val="002060"/>
-        </w:rPr>
-        <w:t xml:space="preserve"> </w:t>
+          <w:lang w:val="fr-FR"/>
+        </w:rPr>
+        <w:t xml:space="preserve"> et </w:t>
       </w:r>
       <w:r>
         <w:rPr>
           <w:rStyle w:val="lev"/>
           <w:color w:val="002060"/>
-        </w:rPr>
-        <w:t>.</w:t>
+          <w:lang w:val="fr-FR"/>
+        </w:rPr>
+        <w:t>application-*.</w:t>
       </w:r>
       <w:proofErr w:type="spellStart"/>
       <w:r>
         <w:rPr>
           <w:rStyle w:val="lev"/>
           <w:color w:val="002060"/>
-        </w:rPr>
-        <w:t>env</w:t>
+          <w:lang w:val="fr-FR"/>
+        </w:rPr>
+        <w:t>yml</w:t>
       </w:r>
       <w:proofErr w:type="spellEnd"/>
       <w:r>
         <w:rPr>
           <w:color w:val="002060"/>
-        </w:rPr>
-        <w:t xml:space="preserve"> </w:t>
-      </w:r>
-      <w:proofErr w:type="gramStart"/>
-      <w:r>
-        <w:rPr>
-          <w:color w:val="002060"/>
-        </w:rPr>
-        <w:t>et</w:t>
-      </w:r>
-      <w:proofErr w:type="gramEnd"/>
-      <w:r>
-        <w:rPr>
-          <w:color w:val="002060"/>
-        </w:rPr>
-        <w:t xml:space="preserve"> </w:t>
-      </w:r>
-      <w:r>
-        <w:rPr>
-          <w:rStyle w:val="lev"/>
-          <w:color w:val="002060"/>
-        </w:rPr>
-        <w:t>application-*.</w:t>
-      </w:r>
-      <w:proofErr w:type="spellStart"/>
-      <w:r>
-        <w:rPr>
-          <w:rStyle w:val="lev"/>
-          <w:color w:val="002060"/>
-        </w:rPr>
-        <w:t>yml</w:t>
-      </w:r>
-      <w:proofErr w:type="spellEnd"/>
-      <w:r>
-        <w:rPr>
-          <w:color w:val="002060"/>
-        </w:rPr>
-        <w:t xml:space="preserve"> </w:t>
-      </w:r>
-      <w:proofErr w:type="spellStart"/>
-      <w:r>
-        <w:rPr>
-          <w:color w:val="002060"/>
-        </w:rPr>
-        <w:t>centralisent</w:t>
-      </w:r>
-      <w:proofErr w:type="spellEnd"/>
-      <w:r>
-        <w:rPr>
-          <w:color w:val="002060"/>
-        </w:rPr>
-        <w:t xml:space="preserve"> </w:t>
-      </w:r>
-      <w:proofErr w:type="spellStart"/>
-      <w:r>
-        <w:rPr>
-          <w:color w:val="002060"/>
-        </w:rPr>
-        <w:t>toute</w:t>
-      </w:r>
-      <w:proofErr w:type="spellEnd"/>
-      <w:r>
-        <w:rPr>
-          <w:color w:val="002060"/>
-        </w:rPr>
-        <w:t xml:space="preserve"> la configuration de </w:t>
-      </w:r>
-      <w:proofErr w:type="spellStart"/>
-      <w:r>
-        <w:rPr>
-          <w:color w:val="002060"/>
-        </w:rPr>
-        <w:t>l'application</w:t>
-      </w:r>
-      <w:proofErr w:type="spellEnd"/>
-      <w:r>
-        <w:rPr>
-          <w:color w:val="002060"/>
-        </w:rPr>
-        <w:t>.</w:t>
+          <w:lang w:val="fr-FR"/>
+        </w:rPr>
+        <w:t xml:space="preserve"> centralisent toute la configuration de l'application.</w:t>
       </w:r>
     </w:p>
     <w:p>
@@ -5903,6 +5710,7 @@
           <w:color w:val="002060"/>
           <w:sz w:val="24"/>
           <w:szCs w:val="24"/>
+          <w:lang w:val="fr-FR"/>
         </w:rPr>
       </w:pPr>
       <w:r>
@@ -5911,6 +5719,7 @@
           <w:color w:val="002060"/>
           <w:sz w:val="24"/>
           <w:szCs w:val="24"/>
+          <w:lang w:val="fr-FR"/>
         </w:rPr>
         <w:t>10. Conclusion</w:t>
       </w:r>
@@ -30260,7 +30069,7 @@
 </file>
 
 <file path=customXml/itemProps1.xml><?xml version="1.0" encoding="utf-8"?>
-<ds:datastoreItem xmlns:ds="http://schemas.openxmlformats.org/officeDocument/2006/customXml" ds:itemID="{2155FB3B-86BB-4439-AD71-ABFE4AC66B59}">
+<ds:datastoreItem xmlns:ds="http://schemas.openxmlformats.org/officeDocument/2006/customXml" ds:itemID="{482C55B8-5F3E-4A9D-A548-DAA2F8AFD2D3}">
   <ds:schemaRefs>
     <ds:schemaRef ds:uri="http://schemas.openxmlformats.org/officeDocument/2006/bibliography"/>
   </ds:schemaRefs>

</xml_diff>